<commit_message>
update: 更新 template_profit.docx 分潤合約範本
Co-Authored-By: Claude Sonnet 4.6 <noreply@anthropic.com>
</commit_message>
<xml_diff>
--- a/自動產生合約範本/template_profit.docx
+++ b/自動產生合約範本/template_profit.docx
@@ -3124,137 +3124,287 @@
         <w:spacing w:line="420" w:lineRule="auto"/>
         <w:jc w:val="both"/>
         <w:rPr>
+          <w:rFonts w:ascii="微軟正黑體" w:eastAsia="微軟正黑體" w:hAnsi="微軟正黑體" w:cs="微軟正黑體"/>
+        </w:rPr>
+      </w:pPr>
+      <w:r>
+        <w:rPr>
+          <w:rFonts w:asciiTheme="minorEastAsia" w:hAnsiTheme="minorEastAsia" w:cs="冬青黑體簡體中文 W3" w:hint="eastAsia"/>
+        </w:rPr>
+        <w:t>電子信箱：</w:t>
+      </w:r>
+      <w:proofErr w:type="gramStart"/>
+      <w:r>
+        <w:rPr>
+          <w:rFonts w:asciiTheme="minorEastAsia" w:hAnsiTheme="minorEastAsia" w:cs="冬青黑體簡體中文 W3"/>
+          <w:color w:val="000000"/>
+        </w:rPr>
+        <w:t xml:space="preserve">{{ </w:t>
+      </w:r>
+      <w:r>
+        <w:rPr>
+          <w:rFonts w:asciiTheme="minorEastAsia" w:hAnsiTheme="minorEastAsia" w:cs="冬青黑體簡體中文 W3" w:hint="eastAsia"/>
+          <w:color w:val="000000"/>
+        </w:rPr>
+        <w:t>email</w:t>
+      </w:r>
+      <w:proofErr w:type="gramEnd"/>
+      <w:r>
+        <w:rPr>
+          <w:rFonts w:asciiTheme="minorEastAsia" w:hAnsiTheme="minorEastAsia" w:cs="冬青黑體簡體中文 W3"/>
+          <w:color w:val="000000"/>
+        </w:rPr>
+        <w:t xml:space="preserve"> }}</w:t>
+      </w:r>
+    </w:p>
+    <w:p>
+      <w:pPr>
+        <w:spacing w:line="420" w:lineRule="auto"/>
+        <w:jc w:val="both"/>
+        <w:rPr>
+          <w:rFonts w:ascii="微軟正黑體" w:eastAsia="微軟正黑體" w:hAnsi="微軟正黑體" w:cs="微軟正黑體"/>
+          <w:color w:val="000000"/>
+        </w:rPr>
+      </w:pPr>
+    </w:p>
+    <w:p>
+      <w:pPr>
+        <w:spacing w:line="420" w:lineRule="auto"/>
+        <w:jc w:val="both"/>
+        <w:rPr>
+          <w:rFonts w:ascii="微軟正黑體" w:eastAsia="微軟正黑體" w:hAnsi="微軟正黑體" w:cs="微軟正黑體"/>
+          <w:color w:val="000000"/>
+        </w:rPr>
+      </w:pPr>
+      <w:r>
+        <w:rPr>
+          <w:rFonts w:ascii="微軟正黑體" w:eastAsia="微軟正黑體" w:hAnsi="微軟正黑體" w:cs="微軟正黑體"/>
+          <w:color w:val="000000"/>
+        </w:rPr>
+        <w:t>乙方（蓋章）： {{ party_b }}</w:t>
+      </w:r>
+    </w:p>
+    <w:p>
+      <w:pPr>
+        <w:spacing w:line="420" w:lineRule="auto"/>
+        <w:jc w:val="both"/>
+        <w:rPr>
+          <w:rFonts w:ascii="微軟正黑體" w:eastAsia="微軟正黑體" w:hAnsi="微軟正黑體" w:cs="微軟正黑體"/>
+          <w:color w:val="000000"/>
+        </w:rPr>
+      </w:pPr>
+      <w:r>
+        <w:rPr>
+          <w:rFonts w:ascii="微軟正黑體" w:eastAsia="微軟正黑體" w:hAnsi="微軟正黑體" w:cs="微軟正黑體"/>
+          <w:color w:val="000000"/>
+        </w:rPr>
+        <w:t>負責人： {{ b_owner }}</w:t>
+      </w:r>
+    </w:p>
+    <w:p>
+      <w:pPr>
+        <w:spacing w:line="420" w:lineRule="auto"/>
+        <w:jc w:val="both"/>
+        <w:rPr>
+          <w:rFonts w:ascii="微軟正黑體" w:eastAsia="微軟正黑體" w:hAnsi="微軟正黑體" w:cs="微軟正黑體"/>
+          <w:color w:val="000000"/>
+        </w:rPr>
+      </w:pPr>
+      <w:r>
+        <w:rPr>
+          <w:rFonts w:ascii="微軟正黑體" w:eastAsia="微軟正黑體" w:hAnsi="微軟正黑體" w:cs="微軟正黑體"/>
+          <w:color w:val="000000"/>
+        </w:rPr>
+        <w:t>統</w:t>
+      </w:r>
+      <w:r>
+        <w:rPr>
           <w:rFonts w:ascii="微軟正黑體" w:eastAsia="微軟正黑體" w:hAnsi="微軟正黑體" w:cs="微軟正黑體" w:hint="eastAsia"/>
-        </w:rPr>
-      </w:pPr>
-      <w:r>
-        <w:rPr>
-          <w:rFonts w:asciiTheme="minorEastAsia" w:hAnsiTheme="minorEastAsia" w:cs="冬青黑體簡體中文 W3" w:hint="eastAsia"/>
+          <w:color w:val="000000"/>
+        </w:rPr>
+        <w:t>一</w:t>
+      </w:r>
+      <w:r>
+        <w:rPr>
+          <w:rFonts w:ascii="微軟正黑體" w:eastAsia="微軟正黑體" w:hAnsi="微軟正黑體" w:cs="微軟正黑體"/>
+          <w:color w:val="000000"/>
+        </w:rPr>
+        <w:t>編</w:t>
+      </w:r>
+      <w:r>
+        <w:rPr>
+          <w:rFonts w:ascii="微軟正黑體" w:eastAsia="微軟正黑體" w:hAnsi="微軟正黑體" w:cs="微軟正黑體" w:hint="eastAsia"/>
+          <w:color w:val="000000"/>
+        </w:rPr>
+        <w:t>號</w:t>
+      </w:r>
+      <w:r>
+        <w:rPr>
+          <w:rFonts w:ascii="微軟正黑體" w:eastAsia="微軟正黑體" w:hAnsi="微軟正黑體" w:cs="微軟正黑體"/>
+          <w:color w:val="000000"/>
+        </w:rPr>
+        <w:t>：</w:t>
+      </w:r>
+      <w:proofErr w:type="gramStart"/>
+      <w:r>
+        <w:rPr>
+          <w:rFonts w:ascii="微軟正黑體" w:eastAsia="微軟正黑體" w:hAnsi="微軟正黑體" w:cs="微軟正黑體"/>
+          <w:color w:val="000000"/>
+        </w:rPr>
+        <w:t>{{ b</w:t>
+      </w:r>
+      <w:proofErr w:type="gramEnd"/>
+      <w:r>
+        <w:rPr>
+          <w:rFonts w:ascii="微軟正黑體" w:eastAsia="微軟正黑體" w:hAnsi="微軟正黑體" w:cs="微軟正黑體"/>
+          <w:color w:val="000000"/>
+        </w:rPr>
+        <w:t>_</w:t>
+      </w:r>
+      <w:proofErr w:type="gramStart"/>
+      <w:r>
+        <w:rPr>
+          <w:rFonts w:ascii="微軟正黑體" w:eastAsia="微軟正黑體" w:hAnsi="微軟正黑體" w:cs="微軟正黑體"/>
+          <w:color w:val="000000"/>
+        </w:rPr>
+        <w:t>id }</w:t>
+      </w:r>
+      <w:proofErr w:type="gramEnd"/>
+      <w:r>
+        <w:rPr>
+          <w:rFonts w:ascii="微軟正黑體" w:eastAsia="微軟正黑體" w:hAnsi="微軟正黑體" w:cs="微軟正黑體"/>
+          <w:color w:val="000000"/>
+        </w:rPr>
+        <w:t>}</w:t>
+      </w:r>
+    </w:p>
+    <w:p>
+      <w:pPr>
+        <w:spacing w:line="420" w:lineRule="auto"/>
+        <w:jc w:val="both"/>
+        <w:rPr>
+          <w:rFonts w:ascii="微軟正黑體" w:eastAsia="微軟正黑體" w:hAnsi="微軟正黑體" w:cs="微軟正黑體"/>
+          <w:color w:val="000000"/>
+        </w:rPr>
+      </w:pPr>
+      <w:r>
+        <w:rPr>
+          <w:rFonts w:ascii="微軟正黑體" w:eastAsia="微軟正黑體" w:hAnsi="微軟正黑體" w:cs="微軟正黑體"/>
+          <w:color w:val="000000"/>
+        </w:rPr>
+        <w:t>聯絡電話：{{ b_phone }}</w:t>
+      </w:r>
+    </w:p>
+    <w:p>
+      <w:pPr>
+        <w:spacing w:line="420" w:lineRule="auto"/>
+        <w:jc w:val="both"/>
+        <w:rPr>
+          <w:rFonts w:ascii="微軟正黑體" w:eastAsia="微軟正黑體" w:hAnsi="微軟正黑體" w:cs="微軟正黑體"/>
+          <w:color w:val="333333"/>
+        </w:rPr>
+      </w:pPr>
+      <w:r>
+        <w:rPr>
+          <w:rFonts w:ascii="微軟正黑體" w:eastAsia="微軟正黑體" w:hAnsi="微軟正黑體" w:cs="微軟正黑體"/>
+        </w:rPr>
+        <w:t>地址：</w:t>
+      </w:r>
+      <w:proofErr w:type="gramStart"/>
+      <w:r>
+        <w:rPr>
+          <w:rFonts w:ascii="微軟正黑體" w:eastAsia="微軟正黑體" w:hAnsi="微軟正黑體" w:cs="微軟正黑體"/>
+          <w:color w:val="333333"/>
+        </w:rPr>
+        <w:t>{{ b</w:t>
+      </w:r>
+      <w:proofErr w:type="gramEnd"/>
+      <w:r>
+        <w:rPr>
+          <w:rFonts w:ascii="微軟正黑體" w:eastAsia="微軟正黑體" w:hAnsi="微軟正黑體" w:cs="微軟正黑體"/>
+          <w:color w:val="333333"/>
+        </w:rPr>
+        <w:t>_</w:t>
+      </w:r>
+      <w:proofErr w:type="gramStart"/>
+      <w:r>
+        <w:rPr>
+          <w:rFonts w:ascii="微軟正黑體" w:eastAsia="微軟正黑體" w:hAnsi="微軟正黑體" w:cs="微軟正黑體"/>
+          <w:color w:val="333333"/>
+        </w:rPr>
+        <w:t>address }</w:t>
+      </w:r>
+      <w:proofErr w:type="gramEnd"/>
+      <w:r>
+        <w:rPr>
+          <w:rFonts w:ascii="微軟正黑體" w:eastAsia="微軟正黑體" w:hAnsi="微軟正黑體" w:cs="微軟正黑體"/>
+          <w:color w:val="333333"/>
+        </w:rPr>
+        <w:t>}</w:t>
+      </w:r>
+    </w:p>
+    <w:p>
+      <w:pPr>
+        <w:spacing w:line="420" w:lineRule="auto"/>
+        <w:jc w:val="both"/>
+        <w:rPr>
+          <w:rFonts w:ascii="微軟正黑體" w:eastAsia="微軟正黑體" w:hAnsi="微軟正黑體" w:cs="微軟正黑體"/>
+        </w:rPr>
+      </w:pPr>
+      <w:r>
+        <w:rPr>
+          <w:rFonts w:ascii="微軟正黑體" w:eastAsia="微軟正黑體" w:hAnsi="微軟正黑體" w:cs="微軟正黑體" w:hint="eastAsia"/>
+          <w:color w:val="333333"/>
         </w:rPr>
         <w:t>電子信箱：</w:t>
       </w:r>
       <w:proofErr w:type="gramStart"/>
       <w:r>
         <w:rPr>
-          <w:rFonts w:asciiTheme="minorEastAsia" w:hAnsiTheme="minorEastAsia" w:cs="冬青黑體簡體中文 W3"/>
-          <w:color w:val="000000"/>
+          <w:rFonts w:ascii="微軟正黑體" w:eastAsia="微軟正黑體" w:hAnsi="微軟正黑體" w:cs="微軟正黑體"/>
+          <w:color w:val="333333"/>
         </w:rPr>
         <w:t xml:space="preserve">{{ </w:t>
       </w:r>
-      <w:r>
-        <w:rPr>
-          <w:rFonts w:asciiTheme="minorEastAsia" w:hAnsiTheme="minorEastAsia" w:cs="冬青黑體簡體中文 W3" w:hint="eastAsia"/>
-          <w:color w:val="000000"/>
+      <w:proofErr w:type="spellStart"/>
+      <w:r>
+        <w:rPr>
+          <w:rFonts w:ascii="微軟正黑體" w:eastAsia="微軟正黑體" w:hAnsi="微軟正黑體" w:cs="微軟正黑體"/>
+          <w:color w:val="333333"/>
+        </w:rPr>
+        <w:t>b</w:t>
+      </w:r>
+      <w:proofErr w:type="gramEnd"/>
+      <w:r>
+        <w:rPr>
+          <w:rFonts w:ascii="微軟正黑體" w:eastAsia="微軟正黑體" w:hAnsi="微軟正黑體" w:cs="微軟正黑體"/>
+          <w:color w:val="333333"/>
+        </w:rPr>
+        <w:t>_</w:t>
+      </w:r>
+      <w:proofErr w:type="gramStart"/>
+      <w:r>
+        <w:rPr>
+          <w:rFonts w:ascii="微軟正黑體" w:eastAsia="微軟正黑體" w:hAnsi="微軟正黑體" w:cs="微軟正黑體" w:hint="eastAsia"/>
+          <w:color w:val="333333"/>
         </w:rPr>
         <w:t>email</w:t>
       </w:r>
+      <w:proofErr w:type="spellEnd"/>
+      <w:r>
+        <w:rPr>
+          <w:rFonts w:ascii="微軟正黑體" w:eastAsia="微軟正黑體" w:hAnsi="微軟正黑體" w:cs="微軟正黑體"/>
+          <w:color w:val="333333"/>
+        </w:rPr>
+        <w:t xml:space="preserve"> }</w:t>
+      </w:r>
       <w:proofErr w:type="gramEnd"/>
       <w:r>
         <w:rPr>
-          <w:rFonts w:asciiTheme="minorEastAsia" w:hAnsiTheme="minorEastAsia" w:cs="冬青黑體簡體中文 W3"/>
-          <w:color w:val="000000"/>
-        </w:rPr>
-        <w:t xml:space="preserve"> }}</w:t>
-      </w:r>
-    </w:p>
-    <w:p>
-      <w:pPr>
-        <w:spacing w:line="420" w:lineRule="auto"/>
-        <w:jc w:val="both"/>
-        <w:rPr>
-          <w:rFonts w:ascii="微軟正黑體" w:eastAsia="微軟正黑體" w:hAnsi="微軟正黑體" w:cs="微軟正黑體"/>
-          <w:color w:val="000000"/>
-        </w:rPr>
-      </w:pPr>
-    </w:p>
-    <w:p>
-      <w:pPr>
-        <w:spacing w:line="420" w:lineRule="auto"/>
-        <w:jc w:val="both"/>
-        <w:rPr>
-          <w:rFonts w:ascii="微軟正黑體" w:eastAsia="微軟正黑體" w:hAnsi="微軟正黑體" w:cs="微軟正黑體"/>
-          <w:color w:val="000000"/>
-        </w:rPr>
-      </w:pPr>
-      <w:r>
-        <w:rPr>
-          <w:rFonts w:ascii="微軟正黑體" w:eastAsia="微軟正黑體" w:hAnsi="微軟正黑體" w:cs="微軟正黑體"/>
-          <w:color w:val="000000"/>
-        </w:rPr>
-        <w:t>乙方（蓋章）： {{ party_b }}</w:t>
-      </w:r>
-    </w:p>
-    <w:p>
-      <w:pPr>
-        <w:spacing w:line="420" w:lineRule="auto"/>
-        <w:jc w:val="both"/>
-        <w:rPr>
-          <w:rFonts w:ascii="微軟正黑體" w:eastAsia="微軟正黑體" w:hAnsi="微軟正黑體" w:cs="微軟正黑體"/>
-          <w:color w:val="000000"/>
-        </w:rPr>
-      </w:pPr>
-      <w:r>
-        <w:rPr>
-          <w:rFonts w:ascii="微軟正黑體" w:eastAsia="微軟正黑體" w:hAnsi="微軟正黑體" w:cs="微軟正黑體"/>
-          <w:color w:val="000000"/>
-        </w:rPr>
-        <w:t>負責人： {{ b_owner }}</w:t>
-      </w:r>
-    </w:p>
-    <w:p>
-      <w:pPr>
-        <w:spacing w:line="420" w:lineRule="auto"/>
-        <w:jc w:val="both"/>
-        <w:rPr>
-          <w:rFonts w:ascii="微軟正黑體" w:eastAsia="微軟正黑體" w:hAnsi="微軟正黑體" w:cs="微軟正黑體"/>
-          <w:color w:val="000000"/>
-        </w:rPr>
-      </w:pPr>
-      <w:r>
-        <w:rPr>
-          <w:rFonts w:ascii="微軟正黑體" w:eastAsia="微軟正黑體" w:hAnsi="微軟正黑體" w:cs="微軟正黑體"/>
-          <w:color w:val="000000"/>
-        </w:rPr>
-        <w:t>身分證字號/統編：{{ b_id }}</w:t>
-      </w:r>
-    </w:p>
-    <w:p>
-      <w:pPr>
-        <w:spacing w:line="420" w:lineRule="auto"/>
-        <w:jc w:val="both"/>
-        <w:rPr>
-          <w:rFonts w:ascii="微軟正黑體" w:eastAsia="微軟正黑體" w:hAnsi="微軟正黑體" w:cs="微軟正黑體"/>
-          <w:color w:val="000000"/>
-        </w:rPr>
-      </w:pPr>
-      <w:r>
-        <w:rPr>
-          <w:rFonts w:ascii="微軟正黑體" w:eastAsia="微軟正黑體" w:hAnsi="微軟正黑體" w:cs="微軟正黑體"/>
-          <w:color w:val="000000"/>
-        </w:rPr>
-        <w:t>聯絡電話：{{ b_phone }}</w:t>
-      </w:r>
-    </w:p>
-    <w:p>
-      <w:pPr>
-        <w:spacing w:line="420" w:lineRule="auto"/>
-        <w:jc w:val="both"/>
-        <w:rPr>
-          <w:rFonts w:ascii="微軟正黑體" w:eastAsia="微軟正黑體" w:hAnsi="微軟正黑體" w:cs="微軟正黑體"/>
-        </w:rPr>
-      </w:pPr>
-      <w:r>
-        <w:rPr>
-          <w:rFonts w:ascii="微軟正黑體" w:eastAsia="微軟正黑體" w:hAnsi="微軟正黑體" w:cs="微軟正黑體"/>
-        </w:rPr>
-        <w:t>地址：</w:t>
-      </w:r>
-      <w:r>
-        <w:rPr>
           <w:rFonts w:ascii="微軟正黑體" w:eastAsia="微軟正黑體" w:hAnsi="微軟正黑體" w:cs="微軟正黑體"/>
           <w:color w:val="333333"/>
         </w:rPr>
-        <w:t>{{ b_address }}</w:t>
+        <w:t>}</w:t>
       </w:r>
     </w:p>
     <w:p>

</xml_diff>

<commit_message>
更新合約範本 template_rent / template_profit
Co-Authored-By: Claude Sonnet 4.6 <noreply@anthropic.com>
</commit_message>
<xml_diff>
--- a/自動產生合約範本/template_profit.docx
+++ b/自動產生合約範本/template_profit.docx
@@ -192,23 +192,7 @@
           <w:rFonts w:asciiTheme="minorEastAsia" w:hAnsiTheme="minorEastAsia" w:cs="冬青黑體簡體中文 W3"/>
           <w:color w:val="000000"/>
         </w:rPr>
-        <w:t xml:space="preserve">{{ </w:t>
-      </w:r>
-      <w:proofErr w:type="spellStart"/>
-      <w:r>
-        <w:rPr>
-          <w:rFonts w:asciiTheme="minorEastAsia" w:hAnsiTheme="minorEastAsia" w:cs="冬青黑體簡體中文 W3"/>
-          <w:color w:val="000000"/>
-        </w:rPr>
-        <w:t>party_a</w:t>
-      </w:r>
-      <w:proofErr w:type="spellEnd"/>
-      <w:r>
-        <w:rPr>
-          <w:rFonts w:asciiTheme="minorEastAsia" w:hAnsiTheme="minorEastAsia" w:cs="冬青黑體簡體中文 W3"/>
-          <w:color w:val="000000"/>
-        </w:rPr>
-        <w:t xml:space="preserve"> }}</w:t>
+        <w:t>{{ party_a }}</w:t>
       </w:r>
       <w:r>
         <w:rPr>
@@ -581,84 +565,40 @@
           <w:rFonts w:asciiTheme="minorEastAsia" w:hAnsiTheme="minorEastAsia" w:cs="冬青黑體簡體中文 W3"/>
           <w:color w:val="000000"/>
         </w:rPr>
-        <w:t xml:space="preserve">{{ </w:t>
-      </w:r>
-      <w:proofErr w:type="spellStart"/>
+        <w:t>{{ tax_type }}</w:t>
+      </w:r>
+      <w:r>
+        <w:rPr>
+          <w:rFonts w:ascii="微軟正黑體" w:eastAsia="微軟正黑體" w:hAnsi="微軟正黑體" w:cs="微軟正黑體"/>
+          <w:color w:val="000000"/>
+        </w:rPr>
+        <w:t>，並扣除因本停車場營運所生之政府機關罰鍰/罰單後，下稱「停車場營收」），由甲乙雙方依甲方分得</w:t>
+      </w:r>
       <w:r>
         <w:rPr>
           <w:rFonts w:asciiTheme="minorEastAsia" w:hAnsiTheme="minorEastAsia" w:cs="冬青黑體簡體中文 W3"/>
-          <w:color w:val="000000"/>
-        </w:rPr>
-        <w:t>tax_type</w:t>
-      </w:r>
-      <w:proofErr w:type="spellEnd"/>
+        </w:rPr>
+        <w:t>{{ party_a_percent }}</w:t>
+      </w:r>
+      <w:r>
+        <w:rPr>
+          <w:rFonts w:ascii="微軟正黑體" w:eastAsia="微軟正黑體" w:hAnsi="微軟正黑體" w:cs="微軟正黑體"/>
+          <w:color w:val="000000"/>
+        </w:rPr>
+        <w:t>%</w:t>
+      </w:r>
+      <w:r>
+        <w:rPr>
+          <w:rFonts w:ascii="微軟正黑體" w:eastAsia="微軟正黑體" w:hAnsi="微軟正黑體" w:cs="微軟正黑體"/>
+          <w:color w:val="000000"/>
+        </w:rPr>
+        <w:t>、乙方分得</w:t>
+      </w:r>
       <w:r>
         <w:rPr>
           <w:rFonts w:asciiTheme="minorEastAsia" w:hAnsiTheme="minorEastAsia" w:cs="冬青黑體簡體中文 W3"/>
-          <w:color w:val="000000"/>
-        </w:rPr>
-        <w:t xml:space="preserve"> }}</w:t>
-      </w:r>
-      <w:r>
-        <w:rPr>
-          <w:rFonts w:ascii="微軟正黑體" w:eastAsia="微軟正黑體" w:hAnsi="微軟正黑體" w:cs="微軟正黑體"/>
-          <w:color w:val="000000"/>
-        </w:rPr>
-        <w:t>，並扣除因本停車場營運所生之政府機關罰鍰/罰單後，下稱「停車場營收」），由甲乙雙方依甲方分得</w:t>
-      </w:r>
-      <w:r>
-        <w:rPr>
-          <w:rFonts w:asciiTheme="minorEastAsia" w:hAnsiTheme="minorEastAsia" w:cs="冬青黑體簡體中文 W3"/>
-        </w:rPr>
-        <w:t xml:space="preserve">{{ </w:t>
-      </w:r>
-      <w:proofErr w:type="spellStart"/>
-      <w:r>
-        <w:rPr>
-          <w:rFonts w:asciiTheme="minorEastAsia" w:hAnsiTheme="minorEastAsia" w:cs="冬青黑體簡體中文 W3"/>
-        </w:rPr>
-        <w:t>party_a_percent</w:t>
-      </w:r>
-      <w:proofErr w:type="spellEnd"/>
-      <w:r>
-        <w:rPr>
-          <w:rFonts w:asciiTheme="minorEastAsia" w:hAnsiTheme="minorEastAsia" w:cs="冬青黑體簡體中文 W3"/>
-        </w:rPr>
-        <w:t xml:space="preserve"> }}</w:t>
-      </w:r>
-      <w:r>
-        <w:rPr>
-          <w:rFonts w:ascii="微軟正黑體" w:eastAsia="微軟正黑體" w:hAnsi="微軟正黑體" w:cs="微軟正黑體"/>
-          <w:color w:val="000000"/>
-        </w:rPr>
-        <w:t>%</w:t>
-      </w:r>
-      <w:r>
-        <w:rPr>
-          <w:rFonts w:ascii="微軟正黑體" w:eastAsia="微軟正黑體" w:hAnsi="微軟正黑體" w:cs="微軟正黑體"/>
-          <w:color w:val="000000"/>
-        </w:rPr>
-        <w:t>、乙方分得</w:t>
-      </w:r>
-      <w:r>
-        <w:rPr>
-          <w:rFonts w:asciiTheme="minorEastAsia" w:hAnsiTheme="minorEastAsia" w:cs="冬青黑體簡體中文 W3"/>
-        </w:rPr>
-        <w:t xml:space="preserve">{{ </w:t>
-      </w:r>
-      <w:proofErr w:type="spellStart"/>
-      <w:r>
-        <w:rPr>
-          <w:rFonts w:asciiTheme="minorEastAsia" w:hAnsiTheme="minorEastAsia" w:cs="冬青黑體簡體中文 W3"/>
-        </w:rPr>
-        <w:t>party_b_percent</w:t>
-      </w:r>
-      <w:proofErr w:type="spellEnd"/>
-      <w:r>
-        <w:rPr>
-          <w:rFonts w:asciiTheme="minorEastAsia" w:hAnsiTheme="minorEastAsia" w:cs="冬青黑體簡體中文 W3"/>
-        </w:rPr>
-        <w:t xml:space="preserve"> }}</w:t>
+        </w:rPr>
+        <w:t>{{ party_b_percent }}</w:t>
       </w:r>
       <w:r>
         <w:rPr>
@@ -950,23 +890,7 @@
           <w:color w:val="000000"/>
         </w:rPr>
         <w:lastRenderedPageBreak/>
-        <w:t>甲方若承認乙方所提出之營收報表，應以書面通知乙方，乙方收到甲方書面通知者，應於當月二十（20）日前（如遇假日則順延至下個工作日，下稱「付款日」）以匯款方式支付分潤</w:t>
-      </w:r>
-      <w:proofErr w:type="gramStart"/>
-      <w:r>
-        <w:rPr>
-          <w:rFonts w:ascii="微軟正黑體" w:eastAsia="微軟正黑體" w:hAnsi="微軟正黑體" w:cs="微軟正黑體"/>
-          <w:color w:val="000000"/>
-        </w:rPr>
-        <w:t>款項至甲方</w:t>
-      </w:r>
-      <w:proofErr w:type="gramEnd"/>
-      <w:r>
-        <w:rPr>
-          <w:rFonts w:ascii="微軟正黑體" w:eastAsia="微軟正黑體" w:hAnsi="微軟正黑體" w:cs="微軟正黑體"/>
-          <w:color w:val="000000"/>
-        </w:rPr>
-        <w:t>指定之銀行帳戶，匯兌所需一切手續費用由乙方負擔。</w:t>
+        <w:t>甲方若承認乙方所提出之營收報表，應以書面通知乙方，乙方收到甲方書面通知者，應於當月二十（20）日前（如遇假日則順延至下個工作日，下稱「付款日」）以匯款方式支付分潤款項至甲方指定之銀行帳戶，匯兌所需一切手續費用由乙方負擔。</w:t>
       </w:r>
     </w:p>
     <w:p>
@@ -994,55 +918,7 @@
           <w:rFonts w:ascii="微軟正黑體" w:eastAsia="微軟正黑體" w:hAnsi="微軟正黑體" w:cs="微軟正黑體"/>
           <w:color w:val="000000"/>
         </w:rPr>
-        <w:t>甲方為法人者，若承認乙方所提出之營收報表，應即開立並寄送</w:t>
-      </w:r>
-      <w:proofErr w:type="gramStart"/>
-      <w:r>
-        <w:rPr>
-          <w:rFonts w:ascii="微軟正黑體" w:eastAsia="微軟正黑體" w:hAnsi="微軟正黑體" w:cs="微軟正黑體"/>
-          <w:color w:val="000000"/>
-        </w:rPr>
-        <w:t>統一發票予乙方</w:t>
-      </w:r>
-      <w:proofErr w:type="gramEnd"/>
-      <w:r>
-        <w:rPr>
-          <w:rFonts w:ascii="微軟正黑體" w:eastAsia="微軟正黑體" w:hAnsi="微軟正黑體" w:cs="微軟正黑體"/>
-          <w:color w:val="000000"/>
-        </w:rPr>
-        <w:t>，</w:t>
-      </w:r>
-      <w:proofErr w:type="gramStart"/>
-      <w:r>
-        <w:rPr>
-          <w:rFonts w:ascii="微軟正黑體" w:eastAsia="微軟正黑體" w:hAnsi="微軟正黑體" w:cs="微軟正黑體"/>
-          <w:color w:val="000000"/>
-        </w:rPr>
-        <w:t>若乙方</w:t>
-      </w:r>
-      <w:proofErr w:type="gramEnd"/>
-      <w:r>
-        <w:rPr>
-          <w:rFonts w:ascii="微軟正黑體" w:eastAsia="微軟正黑體" w:hAnsi="微軟正黑體" w:cs="微軟正黑體"/>
-          <w:color w:val="000000"/>
-        </w:rPr>
-        <w:t>於付款日前，仍未接獲甲方就前月分潤款項所開立之發票，乙方得不付當月及其後之分潤款項，</w:t>
-      </w:r>
-      <w:proofErr w:type="gramStart"/>
-      <w:r>
-        <w:rPr>
-          <w:rFonts w:ascii="微軟正黑體" w:eastAsia="微軟正黑體" w:hAnsi="微軟正黑體" w:cs="微軟正黑體"/>
-          <w:color w:val="000000"/>
-        </w:rPr>
-        <w:t>至甲方</w:t>
-      </w:r>
-      <w:proofErr w:type="gramEnd"/>
-      <w:r>
-        <w:rPr>
-          <w:rFonts w:ascii="微軟正黑體" w:eastAsia="微軟正黑體" w:hAnsi="微軟正黑體" w:cs="微軟正黑體"/>
-          <w:color w:val="000000"/>
-        </w:rPr>
-        <w:t>補齊所有應開而未之發票為止。</w:t>
+        <w:t>甲方為法人者，若承認乙方所提出之營收報表，應即開立並寄送統一發票予乙方，若乙方於付款日前，仍未接獲甲方就前月分潤款項所開立之發票，乙方得不付當月及其後之分潤款項，至甲方補齊所有應開而未之發票為止。</w:t>
       </w:r>
     </w:p>
     <w:p>
@@ -1070,39 +946,7 @@
           <w:rFonts w:ascii="微軟正黑體" w:eastAsia="微軟正黑體" w:hAnsi="微軟正黑體" w:cs="微軟正黑體"/>
           <w:color w:val="000000"/>
         </w:rPr>
-        <w:t>甲方就其因本契約所得之租金，同意乙方依所得稅法及各類所得扣繳率標準就</w:t>
-      </w:r>
-      <w:proofErr w:type="gramStart"/>
-      <w:r>
-        <w:rPr>
-          <w:rFonts w:ascii="微軟正黑體" w:eastAsia="微軟正黑體" w:hAnsi="微軟正黑體" w:cs="微軟正黑體"/>
-          <w:color w:val="000000"/>
-        </w:rPr>
-        <w:t>所得列單申報</w:t>
-      </w:r>
-      <w:proofErr w:type="gramEnd"/>
-      <w:r>
-        <w:rPr>
-          <w:rFonts w:ascii="微軟正黑體" w:eastAsia="微軟正黑體" w:hAnsi="微軟正黑體" w:cs="微軟正黑體"/>
-          <w:color w:val="000000"/>
-        </w:rPr>
-        <w:t>主管</w:t>
-      </w:r>
-      <w:proofErr w:type="gramStart"/>
-      <w:r>
-        <w:rPr>
-          <w:rFonts w:ascii="微軟正黑體" w:eastAsia="微軟正黑體" w:hAnsi="微軟正黑體" w:cs="微軟正黑體"/>
-          <w:color w:val="000000"/>
-        </w:rPr>
-        <w:t>稽</w:t>
-      </w:r>
-      <w:proofErr w:type="gramEnd"/>
-      <w:r>
-        <w:rPr>
-          <w:rFonts w:ascii="微軟正黑體" w:eastAsia="微軟正黑體" w:hAnsi="微軟正黑體" w:cs="微軟正黑體"/>
-          <w:color w:val="000000"/>
-        </w:rPr>
-        <w:t>徵機關。依甲方之身分，申報所得代號/類別如下（請勾選）：</w:t>
+        <w:t>甲方就其因本契約所得之租金，同意乙方依所得稅法及各類所得扣繳率標準就所得列單申報主管稽徵機關。依甲方之身分，申報所得代號/類別如下（請勾選）：</w:t>
       </w:r>
     </w:p>
     <w:p>
@@ -1279,201 +1123,71 @@
           <w:rFonts w:asciiTheme="minorEastAsia" w:hAnsiTheme="minorEastAsia" w:cs="冬青黑體簡體中文 W3"/>
           <w:color w:val="000000"/>
         </w:rPr>
-        <w:t xml:space="preserve"> </w:t>
-      </w:r>
-      <w:proofErr w:type="gramStart"/>
+        <w:t xml:space="preserve"> {{ bank_name }}</w:t>
+      </w:r>
+    </w:p>
+    <w:p>
+      <w:pPr>
+        <w:pBdr>
+          <w:top w:val="nil"/>
+          <w:left w:val="nil"/>
+          <w:bottom w:val="nil"/>
+          <w:right w:val="nil"/>
+          <w:between w:val="nil"/>
+        </w:pBdr>
+        <w:spacing w:line="420" w:lineRule="auto"/>
+        <w:ind w:left="1560" w:hanging="567"/>
+        <w:jc w:val="both"/>
+        <w:rPr>
+          <w:rFonts w:ascii="微軟正黑體" w:eastAsia="微軟正黑體" w:hAnsi="微軟正黑體" w:cs="微軟正黑體"/>
+          <w:color w:val="000000"/>
+        </w:rPr>
+      </w:pPr>
+      <w:r>
+        <w:rPr>
+          <w:rFonts w:ascii="微軟正黑體" w:eastAsia="微軟正黑體" w:hAnsi="微軟正黑體" w:cs="微軟正黑體"/>
+          <w:color w:val="000000"/>
+        </w:rPr>
+        <w:t>帳戶名稱：</w:t>
+      </w:r>
       <w:r>
         <w:rPr>
           <w:rFonts w:asciiTheme="minorEastAsia" w:hAnsiTheme="minorEastAsia" w:cs="冬青黑體簡體中文 W3"/>
           <w:color w:val="000000"/>
         </w:rPr>
-        <w:t xml:space="preserve">{{ </w:t>
-      </w:r>
-      <w:proofErr w:type="spellStart"/>
+        <w:t>{{ account_name }}</w:t>
+      </w:r>
+    </w:p>
+    <w:p>
+      <w:pPr>
+        <w:pBdr>
+          <w:top w:val="nil"/>
+          <w:left w:val="nil"/>
+          <w:bottom w:val="nil"/>
+          <w:right w:val="nil"/>
+          <w:between w:val="nil"/>
+        </w:pBdr>
+        <w:spacing w:line="420" w:lineRule="auto"/>
+        <w:ind w:left="1560" w:hanging="567"/>
+        <w:jc w:val="both"/>
+        <w:rPr>
+          <w:rFonts w:ascii="微軟正黑體" w:eastAsia="微軟正黑體" w:hAnsi="微軟正黑體" w:cs="微軟正黑體"/>
+          <w:color w:val="000000"/>
+        </w:rPr>
+      </w:pPr>
+      <w:r>
+        <w:rPr>
+          <w:rFonts w:ascii="微軟正黑體" w:eastAsia="微軟正黑體" w:hAnsi="微軟正黑體" w:cs="微軟正黑體"/>
+          <w:color w:val="000000"/>
+        </w:rPr>
+        <w:t>帳戶號碼：</w:t>
+      </w:r>
       <w:r>
         <w:rPr>
           <w:rFonts w:asciiTheme="minorEastAsia" w:hAnsiTheme="minorEastAsia" w:cs="冬青黑體簡體中文 W3"/>
           <w:color w:val="000000"/>
         </w:rPr>
-        <w:t>bank</w:t>
-      </w:r>
-      <w:proofErr w:type="gramEnd"/>
-      <w:r>
-        <w:rPr>
-          <w:rFonts w:asciiTheme="minorEastAsia" w:hAnsiTheme="minorEastAsia" w:cs="冬青黑體簡體中文 W3"/>
-          <w:color w:val="000000"/>
-        </w:rPr>
-        <w:t>_</w:t>
-      </w:r>
-      <w:proofErr w:type="gramStart"/>
-      <w:r>
-        <w:rPr>
-          <w:rFonts w:asciiTheme="minorEastAsia" w:hAnsiTheme="minorEastAsia" w:cs="冬青黑體簡體中文 W3"/>
-          <w:color w:val="000000"/>
-        </w:rPr>
-        <w:t>name</w:t>
-      </w:r>
-      <w:proofErr w:type="spellEnd"/>
-      <w:r>
-        <w:rPr>
-          <w:rFonts w:asciiTheme="minorEastAsia" w:hAnsiTheme="minorEastAsia" w:cs="冬青黑體簡體中文 W3"/>
-          <w:color w:val="000000"/>
-        </w:rPr>
-        <w:t xml:space="preserve"> }</w:t>
-      </w:r>
-      <w:proofErr w:type="gramEnd"/>
-      <w:r>
-        <w:rPr>
-          <w:rFonts w:asciiTheme="minorEastAsia" w:hAnsiTheme="minorEastAsia" w:cs="冬青黑體簡體中文 W3"/>
-          <w:color w:val="000000"/>
-        </w:rPr>
-        <w:t>}</w:t>
-      </w:r>
-    </w:p>
-    <w:p>
-      <w:pPr>
-        <w:pBdr>
-          <w:top w:val="nil"/>
-          <w:left w:val="nil"/>
-          <w:bottom w:val="nil"/>
-          <w:right w:val="nil"/>
-          <w:between w:val="nil"/>
-        </w:pBdr>
-        <w:spacing w:line="420" w:lineRule="auto"/>
-        <w:ind w:left="1560" w:hanging="567"/>
-        <w:jc w:val="both"/>
-        <w:rPr>
-          <w:rFonts w:ascii="微軟正黑體" w:eastAsia="微軟正黑體" w:hAnsi="微軟正黑體" w:cs="微軟正黑體"/>
-          <w:color w:val="000000"/>
-        </w:rPr>
-      </w:pPr>
-      <w:r>
-        <w:rPr>
-          <w:rFonts w:ascii="微軟正黑體" w:eastAsia="微軟正黑體" w:hAnsi="微軟正黑體" w:cs="微軟正黑體"/>
-          <w:color w:val="000000"/>
-        </w:rPr>
-        <w:t>帳戶名稱：</w:t>
-      </w:r>
-      <w:proofErr w:type="gramStart"/>
-      <w:r>
-        <w:rPr>
-          <w:rFonts w:asciiTheme="minorEastAsia" w:hAnsiTheme="minorEastAsia" w:cs="冬青黑體簡體中文 W3"/>
-          <w:color w:val="000000"/>
-        </w:rPr>
-        <w:t xml:space="preserve">{{ </w:t>
-      </w:r>
-      <w:proofErr w:type="spellStart"/>
-      <w:r>
-        <w:rPr>
-          <w:rFonts w:asciiTheme="minorEastAsia" w:hAnsiTheme="minorEastAsia" w:cs="冬青黑體簡體中文 W3"/>
-          <w:color w:val="000000"/>
-        </w:rPr>
-        <w:t>account</w:t>
-      </w:r>
-      <w:proofErr w:type="gramEnd"/>
-      <w:r>
-        <w:rPr>
-          <w:rFonts w:asciiTheme="minorEastAsia" w:hAnsiTheme="minorEastAsia" w:cs="冬青黑體簡體中文 W3"/>
-          <w:color w:val="000000"/>
-        </w:rPr>
-        <w:t>_</w:t>
-      </w:r>
-      <w:proofErr w:type="gramStart"/>
-      <w:r>
-        <w:rPr>
-          <w:rFonts w:asciiTheme="minorEastAsia" w:hAnsiTheme="minorEastAsia" w:cs="冬青黑體簡體中文 W3"/>
-          <w:color w:val="000000"/>
-        </w:rPr>
-        <w:t>name</w:t>
-      </w:r>
-      <w:proofErr w:type="spellEnd"/>
-      <w:r>
-        <w:rPr>
-          <w:rFonts w:asciiTheme="minorEastAsia" w:hAnsiTheme="minorEastAsia" w:cs="冬青黑體簡體中文 W3"/>
-          <w:color w:val="000000"/>
-        </w:rPr>
-        <w:t xml:space="preserve"> }</w:t>
-      </w:r>
-      <w:proofErr w:type="gramEnd"/>
-      <w:r>
-        <w:rPr>
-          <w:rFonts w:asciiTheme="minorEastAsia" w:hAnsiTheme="minorEastAsia" w:cs="冬青黑體簡體中文 W3"/>
-          <w:color w:val="000000"/>
-        </w:rPr>
-        <w:t>}</w:t>
-      </w:r>
-    </w:p>
-    <w:p>
-      <w:pPr>
-        <w:pBdr>
-          <w:top w:val="nil"/>
-          <w:left w:val="nil"/>
-          <w:bottom w:val="nil"/>
-          <w:right w:val="nil"/>
-          <w:between w:val="nil"/>
-        </w:pBdr>
-        <w:spacing w:line="420" w:lineRule="auto"/>
-        <w:ind w:left="1560" w:hanging="567"/>
-        <w:jc w:val="both"/>
-        <w:rPr>
-          <w:rFonts w:ascii="微軟正黑體" w:eastAsia="微軟正黑體" w:hAnsi="微軟正黑體" w:cs="微軟正黑體"/>
-          <w:color w:val="000000"/>
-        </w:rPr>
-      </w:pPr>
-      <w:r>
-        <w:rPr>
-          <w:rFonts w:ascii="微軟正黑體" w:eastAsia="微軟正黑體" w:hAnsi="微軟正黑體" w:cs="微軟正黑體"/>
-          <w:color w:val="000000"/>
-        </w:rPr>
-        <w:t>帳戶號碼：</w:t>
-      </w:r>
-      <w:proofErr w:type="gramStart"/>
-      <w:r>
-        <w:rPr>
-          <w:rFonts w:asciiTheme="minorEastAsia" w:hAnsiTheme="minorEastAsia" w:cs="冬青黑體簡體中文 W3"/>
-          <w:color w:val="000000"/>
-        </w:rPr>
-        <w:t xml:space="preserve">{{ </w:t>
-      </w:r>
-      <w:proofErr w:type="spellStart"/>
-      <w:r>
-        <w:rPr>
-          <w:rFonts w:asciiTheme="minorEastAsia" w:hAnsiTheme="minorEastAsia" w:cs="冬青黑體簡體中文 W3"/>
-          <w:color w:val="000000"/>
-        </w:rPr>
-        <w:t>account</w:t>
-      </w:r>
-      <w:proofErr w:type="gramEnd"/>
-      <w:r>
-        <w:rPr>
-          <w:rFonts w:asciiTheme="minorEastAsia" w:hAnsiTheme="minorEastAsia" w:cs="冬青黑體簡體中文 W3"/>
-          <w:color w:val="000000"/>
-        </w:rPr>
-        <w:t>_</w:t>
-      </w:r>
-      <w:proofErr w:type="gramStart"/>
-      <w:r>
-        <w:rPr>
-          <w:rFonts w:asciiTheme="minorEastAsia" w:hAnsiTheme="minorEastAsia" w:cs="冬青黑體簡體中文 W3"/>
-          <w:color w:val="000000"/>
-        </w:rPr>
-        <w:t>number</w:t>
-      </w:r>
-      <w:proofErr w:type="spellEnd"/>
-      <w:r>
-        <w:rPr>
-          <w:rFonts w:asciiTheme="minorEastAsia" w:hAnsiTheme="minorEastAsia" w:cs="冬青黑體簡體中文 W3"/>
-          <w:color w:val="000000"/>
-        </w:rPr>
-        <w:t xml:space="preserve"> }</w:t>
-      </w:r>
-      <w:proofErr w:type="gramEnd"/>
-      <w:r>
-        <w:rPr>
-          <w:rFonts w:asciiTheme="minorEastAsia" w:hAnsiTheme="minorEastAsia" w:cs="冬青黑體簡體中文 W3"/>
-          <w:color w:val="000000"/>
-        </w:rPr>
-        <w:t>}</w:t>
+        <w:t>{{ account_number }}</w:t>
       </w:r>
     </w:p>
     <w:p>
@@ -1502,23 +1216,8 @@
           <w:rFonts w:ascii="微軟正黑體" w:eastAsia="微軟正黑體" w:hAnsi="微軟正黑體" w:cs="微軟正黑體"/>
           <w:color w:val="000000"/>
         </w:rPr>
-        <w:t>本契約期間內，依據實際營收狀況，若連續兩（2）</w:t>
-      </w:r>
-      <w:proofErr w:type="gramStart"/>
-      <w:r>
-        <w:rPr>
-          <w:rFonts w:ascii="微軟正黑體" w:eastAsia="微軟正黑體" w:hAnsi="微軟正黑體" w:cs="微軟正黑體"/>
-          <w:color w:val="000000"/>
-        </w:rPr>
-        <w:t>個</w:t>
-      </w:r>
-      <w:proofErr w:type="gramEnd"/>
-      <w:r>
-        <w:rPr>
-          <w:rFonts w:ascii="微軟正黑體" w:eastAsia="微軟正黑體" w:hAnsi="微軟正黑體" w:cs="微軟正黑體"/>
-          <w:color w:val="000000"/>
-        </w:rPr>
-        <w:t>月，合作停車場每月每格營業額（營收總額除以總車位數）低於新台幣500元整，乙方得終止本契約並將停管設備拆除收回，乙方不負任何賠償責任且無須給付甲方任何費用。</w:t>
+        <w:lastRenderedPageBreak/>
+        <w:t>本契約期間內，依據實際營收狀況，若連續兩（2）個月，合作停車場每月每格營業額（營收總額除以總車位數）低於新台幣500元整，乙方得終止本契約並將停管設備拆除收回，乙方不負任何賠償責任且無須給付甲方任何費用。</w:t>
       </w:r>
     </w:p>
     <w:p>
@@ -1547,24 +1246,7 @@
           <w:rFonts w:ascii="微軟正黑體" w:eastAsia="微軟正黑體" w:hAnsi="微軟正黑體" w:cs="微軟正黑體"/>
           <w:color w:val="000000"/>
         </w:rPr>
-        <w:lastRenderedPageBreak/>
-        <w:t>除前項規定情形外，乙方如有延遲給付分潤款項達兩（2）</w:t>
-      </w:r>
-      <w:proofErr w:type="gramStart"/>
-      <w:r>
-        <w:rPr>
-          <w:rFonts w:ascii="微軟正黑體" w:eastAsia="微軟正黑體" w:hAnsi="微軟正黑體" w:cs="微軟正黑體"/>
-          <w:color w:val="000000"/>
-        </w:rPr>
-        <w:t>個</w:t>
-      </w:r>
-      <w:proofErr w:type="gramEnd"/>
-      <w:r>
-        <w:rPr>
-          <w:rFonts w:ascii="微軟正黑體" w:eastAsia="微軟正黑體" w:hAnsi="微軟正黑體" w:cs="微軟正黑體"/>
-          <w:color w:val="000000"/>
-        </w:rPr>
-        <w:t>月以上，並經甲方以書面限期繳納後逾期仍未繳付時，甲方得終止本契約。</w:t>
+        <w:t>除前項規定情形外，乙方如有延遲給付分潤款項達兩（2）個月以上，並經甲方以書面限期繳納後逾期仍未繳付時，甲方得終止本契約。</w:t>
       </w:r>
     </w:p>
     <w:p>
@@ -1639,23 +1321,7 @@
           <w:rFonts w:ascii="微軟正黑體" w:eastAsia="微軟正黑體" w:hAnsi="微軟正黑體" w:cs="微軟正黑體"/>
           <w:color w:val="000000"/>
         </w:rPr>
-        <w:t>合作標的物之地價稅、房屋稅、公共安全及消防申報費用應由甲方負擔、其公共安全、消防設備申報</w:t>
-      </w:r>
-      <w:proofErr w:type="gramStart"/>
-      <w:r>
-        <w:rPr>
-          <w:rFonts w:ascii="微軟正黑體" w:eastAsia="微軟正黑體" w:hAnsi="微軟正黑體" w:cs="微軟正黑體"/>
-          <w:color w:val="000000"/>
-        </w:rPr>
-        <w:t>頻率均需遵照</w:t>
-      </w:r>
-      <w:proofErr w:type="gramEnd"/>
-      <w:r>
-        <w:rPr>
-          <w:rFonts w:ascii="微軟正黑體" w:eastAsia="微軟正黑體" w:hAnsi="微軟正黑體" w:cs="微軟正黑體"/>
-          <w:color w:val="000000"/>
-        </w:rPr>
-        <w:t>中華民國停車場相關法規辦理。</w:t>
+        <w:t>合作標的物之地價稅、房屋稅、公共安全及消防申報費用應由甲方負擔、其公共安全、消防設備申報頻率均需遵照中華民國停車場相關法規辦理。</w:t>
       </w:r>
     </w:p>
     <w:p>
@@ -1796,7 +1462,15 @@
           <w:rFonts w:ascii="微軟正黑體" w:eastAsia="微軟正黑體" w:hAnsi="微軟正黑體" w:cs="微軟正黑體"/>
           <w:color w:val="000000"/>
         </w:rPr>
-        <w:t>甲方同意於本契約簽訂後，配合乙方提供為申辦停車場登記證等相關營業證照所必要之一切文件，包括但不限於土地/房屋所有權狀影本等。</w:t>
+        <w:t>甲方同意於本契約簽訂後，配合乙方提供為申辦停車場登記證等相關營業證照所必要之一</w:t>
+      </w:r>
+      <w:r>
+        <w:rPr>
+          <w:rFonts w:ascii="微軟正黑體" w:eastAsia="微軟正黑體" w:hAnsi="微軟正黑體" w:cs="微軟正黑體"/>
+          <w:color w:val="000000"/>
+        </w:rPr>
+        <w:lastRenderedPageBreak/>
+        <w:t>切文件，包括但不限於土地/房屋所有權狀影本等。</w:t>
       </w:r>
     </w:p>
     <w:p>
@@ -1863,7 +1537,6 @@
           <w:rFonts w:ascii="微軟正黑體" w:eastAsia="微軟正黑體" w:hAnsi="微軟正黑體" w:cs="微軟正黑體"/>
           <w:color w:val="000000"/>
         </w:rPr>
-        <w:lastRenderedPageBreak/>
         <w:t>乙方應以善良管理人之注意，管理及維護合作標的物，如有發生合作標的物內之相關設備、車輛毀損、竊盜情事等發生時（除天災或確不可歸責於乙方者外），乙方應積極處理並依相關事證對上開事故究責。</w:t>
       </w:r>
     </w:p>
@@ -2063,48 +1736,20 @@
         <w:rPr>
           <w:rFonts w:asciiTheme="minorEastAsia" w:hAnsiTheme="minorEastAsia" w:cs="冬青黑體簡體中文 W3"/>
         </w:rPr>
-        <w:t xml:space="preserve">{{ </w:t>
-      </w:r>
-      <w:proofErr w:type="spellStart"/>
+        <w:t>{{ start_date }}</w:t>
+      </w:r>
+      <w:r>
+        <w:rPr>
+          <w:rFonts w:ascii="微軟正黑體" w:eastAsia="微軟正黑體" w:hAnsi="微軟正黑體" w:cs="微軟正黑體"/>
+          <w:color w:val="000000"/>
+        </w:rPr>
+        <w:t>（下稱「生效日」）起至</w:t>
+      </w:r>
       <w:r>
         <w:rPr>
           <w:rFonts w:asciiTheme="minorEastAsia" w:hAnsiTheme="minorEastAsia" w:cs="冬青黑體簡體中文 W3"/>
         </w:rPr>
-        <w:t>start_date</w:t>
-      </w:r>
-      <w:proofErr w:type="spellEnd"/>
-      <w:r>
-        <w:rPr>
-          <w:rFonts w:asciiTheme="minorEastAsia" w:hAnsiTheme="minorEastAsia" w:cs="冬青黑體簡體中文 W3"/>
-        </w:rPr>
-        <w:t xml:space="preserve"> }}</w:t>
-      </w:r>
-      <w:r>
-        <w:rPr>
-          <w:rFonts w:ascii="微軟正黑體" w:eastAsia="微軟正黑體" w:hAnsi="微軟正黑體" w:cs="微軟正黑體"/>
-          <w:color w:val="000000"/>
-        </w:rPr>
-        <w:t>（下稱「生效日」）起至</w:t>
-      </w:r>
-      <w:r>
-        <w:rPr>
-          <w:rFonts w:asciiTheme="minorEastAsia" w:hAnsiTheme="minorEastAsia" w:cs="冬青黑體簡體中文 W3"/>
-        </w:rPr>
-        <w:t xml:space="preserve">{{ </w:t>
-      </w:r>
-      <w:proofErr w:type="spellStart"/>
-      <w:r>
-        <w:rPr>
-          <w:rFonts w:asciiTheme="minorEastAsia" w:hAnsiTheme="minorEastAsia" w:cs="冬青黑體簡體中文 W3"/>
-        </w:rPr>
-        <w:t>end_date</w:t>
-      </w:r>
-      <w:proofErr w:type="spellEnd"/>
-      <w:r>
-        <w:rPr>
-          <w:rFonts w:asciiTheme="minorEastAsia" w:hAnsiTheme="minorEastAsia" w:cs="冬青黑體簡體中文 W3"/>
-        </w:rPr>
-        <w:t xml:space="preserve"> }}</w:t>
+        <w:t>{{ end_date }}</w:t>
       </w:r>
       <w:r>
         <w:rPr>
@@ -2140,87 +1785,15 @@
           <w:rFonts w:ascii="微軟正黑體" w:eastAsia="微軟正黑體" w:hAnsi="微軟正黑體" w:cs="微軟正黑體"/>
           <w:color w:val="000000"/>
         </w:rPr>
-        <w:t>本契約期限屆滿時，除任一方於屆滿日前至少</w:t>
-      </w:r>
-      <w:proofErr w:type="gramStart"/>
-      <w:r>
-        <w:rPr>
-          <w:rFonts w:ascii="微軟正黑體" w:eastAsia="微軟正黑體" w:hAnsi="微軟正黑體" w:cs="微軟正黑體"/>
-          <w:color w:val="000000"/>
-        </w:rPr>
-        <w:t>一</w:t>
-      </w:r>
-      <w:proofErr w:type="gramEnd"/>
-      <w:r>
-        <w:rPr>
-          <w:rFonts w:ascii="微軟正黑體" w:eastAsia="微軟正黑體" w:hAnsi="微軟正黑體" w:cs="微軟正黑體"/>
-          <w:color w:val="000000"/>
-        </w:rPr>
-        <w:t>（1）</w:t>
-      </w:r>
-      <w:proofErr w:type="gramStart"/>
-      <w:r>
-        <w:rPr>
-          <w:rFonts w:ascii="微軟正黑體" w:eastAsia="微軟正黑體" w:hAnsi="微軟正黑體" w:cs="微軟正黑體"/>
-          <w:color w:val="000000"/>
-        </w:rPr>
-        <w:t>個</w:t>
-      </w:r>
-      <w:proofErr w:type="gramEnd"/>
-      <w:r>
-        <w:rPr>
-          <w:rFonts w:ascii="微軟正黑體" w:eastAsia="微軟正黑體" w:hAnsi="微軟正黑體" w:cs="微軟正黑體"/>
-          <w:color w:val="000000"/>
-        </w:rPr>
-        <w:t>月前以書面向他方為</w:t>
-      </w:r>
-      <w:proofErr w:type="gramStart"/>
-      <w:r>
-        <w:rPr>
-          <w:rFonts w:ascii="微軟正黑體" w:eastAsia="微軟正黑體" w:hAnsi="微軟正黑體" w:cs="微軟正黑體"/>
-          <w:color w:val="000000"/>
-        </w:rPr>
-        <w:t>不</w:t>
-      </w:r>
-      <w:proofErr w:type="gramEnd"/>
-      <w:r>
-        <w:rPr>
-          <w:rFonts w:ascii="微軟正黑體" w:eastAsia="微軟正黑體" w:hAnsi="微軟正黑體" w:cs="微軟正黑體"/>
-          <w:color w:val="000000"/>
-        </w:rPr>
-        <w:t>續約之通知外，本契約自動展延</w:t>
-      </w:r>
-      <w:proofErr w:type="gramStart"/>
-      <w:r>
-        <w:rPr>
-          <w:rFonts w:ascii="微軟正黑體" w:eastAsia="微軟正黑體" w:hAnsi="微軟正黑體" w:cs="微軟正黑體"/>
-          <w:color w:val="000000"/>
-        </w:rPr>
-        <w:t>一</w:t>
-      </w:r>
-      <w:proofErr w:type="gramEnd"/>
-      <w:r>
-        <w:rPr>
-          <w:rFonts w:ascii="微軟正黑體" w:eastAsia="微軟正黑體" w:hAnsi="微軟正黑體" w:cs="微軟正黑體"/>
-          <w:color w:val="000000"/>
-        </w:rPr>
-        <w:t>（1）年；其後每次展延期限屆滿時，</w:t>
-      </w:r>
-      <w:proofErr w:type="gramStart"/>
-      <w:r>
-        <w:rPr>
-          <w:rFonts w:ascii="微軟正黑體" w:eastAsia="微軟正黑體" w:hAnsi="微軟正黑體" w:cs="微軟正黑體"/>
-          <w:color w:val="000000"/>
-        </w:rPr>
-        <w:t>均依相同</w:t>
-      </w:r>
-      <w:proofErr w:type="gramEnd"/>
-      <w:r>
-        <w:rPr>
-          <w:rFonts w:ascii="微軟正黑體" w:eastAsia="微軟正黑體" w:hAnsi="微軟正黑體" w:cs="微軟正黑體"/>
-          <w:color w:val="000000"/>
-        </w:rPr>
-        <w:t>條件自動順延一年，不限次數。</w:t>
+        <w:t>本契約期限屆滿時，除任一方於屆滿日前至少一（1）個月前以書面向他方為不續約之通知外，本契約自動展延一（1）年；其後每次展延期限屆滿時，均依相同條件自動順延一</w:t>
+      </w:r>
+      <w:r>
+        <w:rPr>
+          <w:rFonts w:ascii="微軟正黑體" w:eastAsia="微軟正黑體" w:hAnsi="微軟正黑體" w:cs="微軟正黑體"/>
+          <w:color w:val="000000"/>
+        </w:rPr>
+        <w:lastRenderedPageBreak/>
+        <w:t>年，不限次數。</w:t>
       </w:r>
     </w:p>
     <w:p>
@@ -2287,24 +1860,7 @@
           <w:rFonts w:ascii="微軟正黑體" w:eastAsia="微軟正黑體" w:hAnsi="微軟正黑體" w:cs="微軟正黑體"/>
           <w:color w:val="000000"/>
         </w:rPr>
-        <w:lastRenderedPageBreak/>
-        <w:t>本契約期間屆滿或終止時，乙方應於到期日或終止日後十五（15）日內，拆除並撤離合作標的物上所有停管設備，並將合作標的物以完整且可使用之狀況</w:t>
-      </w:r>
-      <w:proofErr w:type="gramStart"/>
-      <w:r>
-        <w:rPr>
-          <w:rFonts w:ascii="微軟正黑體" w:eastAsia="微軟正黑體" w:hAnsi="微軟正黑體" w:cs="微軟正黑體"/>
-          <w:color w:val="000000"/>
-        </w:rPr>
-        <w:t>交還予甲方</w:t>
-      </w:r>
-      <w:proofErr w:type="gramEnd"/>
-      <w:r>
-        <w:rPr>
-          <w:rFonts w:ascii="微軟正黑體" w:eastAsia="微軟正黑體" w:hAnsi="微軟正黑體" w:cs="微軟正黑體"/>
-          <w:color w:val="000000"/>
-        </w:rPr>
-        <w:t>。</w:t>
+        <w:t>本契約期間屆滿或終止時，乙方應於到期日或終止日後十五（15）日內，拆除並撤離合作標的物上所有停管設備，並將合作標的物以完整且可使用之狀況交還予甲方。</w:t>
       </w:r>
     </w:p>
     <w:p>
@@ -2389,39 +1945,7 @@
           <w:rFonts w:ascii="微軟正黑體" w:eastAsia="微軟正黑體" w:hAnsi="微軟正黑體" w:cs="微軟正黑體"/>
           <w:color w:val="000000"/>
         </w:rPr>
-        <w:t>本契約之解釋、效力、履行及其他未盡事宜，悉以中華民國法律為</w:t>
-      </w:r>
-      <w:proofErr w:type="gramStart"/>
-      <w:r>
-        <w:rPr>
-          <w:rFonts w:ascii="微軟正黑體" w:eastAsia="微軟正黑體" w:hAnsi="微軟正黑體" w:cs="微軟正黑體"/>
-          <w:color w:val="000000"/>
-        </w:rPr>
-        <w:t>準</w:t>
-      </w:r>
-      <w:proofErr w:type="gramEnd"/>
-      <w:r>
-        <w:rPr>
-          <w:rFonts w:ascii="微軟正黑體" w:eastAsia="微軟正黑體" w:hAnsi="微軟正黑體" w:cs="微軟正黑體"/>
-          <w:color w:val="000000"/>
-        </w:rPr>
-        <w:t>。如因本契約涉訟，雙方合意以臺灣</w:t>
-      </w:r>
-      <w:proofErr w:type="gramStart"/>
-      <w:r>
-        <w:rPr>
-          <w:rFonts w:ascii="微軟正黑體" w:eastAsia="微軟正黑體" w:hAnsi="微軟正黑體" w:cs="微軟正黑體"/>
-          <w:color w:val="000000"/>
-        </w:rPr>
-        <w:t>臺</w:t>
-      </w:r>
-      <w:proofErr w:type="gramEnd"/>
-      <w:r>
-        <w:rPr>
-          <w:rFonts w:ascii="微軟正黑體" w:eastAsia="微軟正黑體" w:hAnsi="微軟正黑體" w:cs="微軟正黑體"/>
-          <w:color w:val="000000"/>
-        </w:rPr>
-        <w:t>北地方法院為第一審專屬管轄法院。</w:t>
+        <w:t>本契約之解釋、效力、履行及其他未盡事宜，悉以中華民國法律為準。如因本契約涉訟，雙方合意以臺灣臺北地方法院為第一審專屬管轄法院。</w:t>
       </w:r>
     </w:p>
     <w:p>
@@ -2478,23 +2002,7 @@
           <w:rFonts w:ascii="微軟正黑體" w:eastAsia="微軟正黑體" w:hAnsi="微軟正黑體" w:cs="微軟正黑體"/>
           <w:color w:val="000000"/>
         </w:rPr>
-        <w:t>甲方同意，如乙方與乙方關係企業（按台灣公司法定義）辦理分割或合併時，乙方於本契約之一切權利義務於分割基準日或合併基準日起，</w:t>
-      </w:r>
-      <w:proofErr w:type="gramStart"/>
-      <w:r>
-        <w:rPr>
-          <w:rFonts w:ascii="微軟正黑體" w:eastAsia="微軟正黑體" w:hAnsi="微軟正黑體" w:cs="微軟正黑體"/>
-          <w:color w:val="000000"/>
-        </w:rPr>
-        <w:t>轉讓予乙方</w:t>
-      </w:r>
-      <w:proofErr w:type="gramEnd"/>
-      <w:r>
-        <w:rPr>
-          <w:rFonts w:ascii="微軟正黑體" w:eastAsia="微軟正黑體" w:hAnsi="微軟正黑體" w:cs="微軟正黑體"/>
-          <w:color w:val="000000"/>
-        </w:rPr>
-        <w:t>分割後受讓營業之既存或新設公司，或合併後之存續公司或新設公司。</w:t>
+        <w:t>甲方同意，如乙方與乙方關係企業（按台灣公司法定義）辦理分割或合併時，乙方於本契約之一切權利義務於分割基準日或合併基準日起，轉讓予乙方分割後受讓營業之既存或新設公司，或合併後之存續公司或新設公司。</w:t>
       </w:r>
     </w:p>
     <w:p>
@@ -2573,39 +2081,15 @@
           <w:rFonts w:ascii="微軟正黑體" w:eastAsia="微軟正黑體" w:hAnsi="微軟正黑體" w:cs="微軟正黑體"/>
           <w:color w:val="000000"/>
         </w:rPr>
-        <w:t>甲乙雙方通訊地址及電子郵件</w:t>
-      </w:r>
-      <w:proofErr w:type="gramStart"/>
-      <w:r>
-        <w:rPr>
-          <w:rFonts w:ascii="微軟正黑體" w:eastAsia="微軟正黑體" w:hAnsi="微軟正黑體" w:cs="微軟正黑體"/>
-          <w:color w:val="000000"/>
-        </w:rPr>
-        <w:t>地址均以本</w:t>
-      </w:r>
-      <w:proofErr w:type="gramEnd"/>
-      <w:r>
-        <w:rPr>
-          <w:rFonts w:ascii="微軟正黑體" w:eastAsia="微軟正黑體" w:hAnsi="微軟正黑體" w:cs="微軟正黑體"/>
-          <w:color w:val="000000"/>
-        </w:rPr>
-        <w:t>契約所</w:t>
-      </w:r>
-      <w:proofErr w:type="gramStart"/>
-      <w:r>
-        <w:rPr>
-          <w:rFonts w:ascii="微軟正黑體" w:eastAsia="微軟正黑體" w:hAnsi="微軟正黑體" w:cs="微軟正黑體"/>
-          <w:color w:val="000000"/>
-        </w:rPr>
-        <w:t>載者為準</w:t>
-      </w:r>
-      <w:proofErr w:type="gramEnd"/>
-      <w:r>
-        <w:rPr>
-          <w:rFonts w:ascii="微軟正黑體" w:eastAsia="微軟正黑體" w:hAnsi="微軟正黑體" w:cs="微軟正黑體"/>
-          <w:color w:val="000000"/>
-        </w:rPr>
-        <w:t>，如有變更者，應以書面通知他方。</w:t>
+        <w:t>甲乙雙方通訊地址及電子郵件地址均以本契約所載者為準，如有變更者，應以書面通知他</w:t>
+      </w:r>
+      <w:r>
+        <w:rPr>
+          <w:rFonts w:ascii="微軟正黑體" w:eastAsia="微軟正黑體" w:hAnsi="微軟正黑體" w:cs="微軟正黑體"/>
+          <w:color w:val="000000"/>
+        </w:rPr>
+        <w:lastRenderedPageBreak/>
+        <w:t>方。</w:t>
       </w:r>
     </w:p>
     <w:p>
@@ -2633,56 +2117,7 @@
           <w:rFonts w:ascii="微軟正黑體" w:eastAsia="微軟正黑體" w:hAnsi="微軟正黑體" w:cs="微軟正黑體"/>
           <w:color w:val="000000"/>
         </w:rPr>
-        <w:t>雙方之郵件通知倘因遷址、拒收、招領逾期或其他郵局批註之理由而送達不到者，</w:t>
-      </w:r>
-      <w:proofErr w:type="gramStart"/>
-      <w:r>
-        <w:rPr>
-          <w:rFonts w:ascii="微軟正黑體" w:eastAsia="微軟正黑體" w:hAnsi="微軟正黑體" w:cs="微軟正黑體"/>
-          <w:color w:val="000000"/>
-        </w:rPr>
-        <w:t>均以郵局</w:t>
-      </w:r>
-      <w:proofErr w:type="gramEnd"/>
-      <w:r>
-        <w:rPr>
-          <w:rFonts w:ascii="微軟正黑體" w:eastAsia="微軟正黑體" w:hAnsi="微軟正黑體" w:cs="微軟正黑體"/>
-          <w:color w:val="000000"/>
-        </w:rPr>
-        <w:t>第一次投遞日期為送達日期。無論收送達之</w:t>
-      </w:r>
-      <w:proofErr w:type="gramStart"/>
-      <w:r>
-        <w:rPr>
-          <w:rFonts w:ascii="微軟正黑體" w:eastAsia="微軟正黑體" w:hAnsi="微軟正黑體" w:cs="微軟正黑體"/>
-          <w:color w:val="000000"/>
-        </w:rPr>
-        <w:t>ㄧ</w:t>
-      </w:r>
-      <w:proofErr w:type="gramEnd"/>
-      <w:r>
-        <w:rPr>
-          <w:rFonts w:ascii="微軟正黑體" w:eastAsia="微軟正黑體" w:hAnsi="微軟正黑體" w:cs="微軟正黑體"/>
-          <w:color w:val="000000"/>
-        </w:rPr>
-        <w:t>方是否確實收受（包括拒收），</w:t>
-      </w:r>
-      <w:proofErr w:type="gramStart"/>
-      <w:r>
-        <w:rPr>
-          <w:rFonts w:ascii="微軟正黑體" w:eastAsia="微軟正黑體" w:hAnsi="微軟正黑體" w:cs="微軟正黑體"/>
-          <w:color w:val="000000"/>
-        </w:rPr>
-        <w:t>均生送達</w:t>
-      </w:r>
-      <w:proofErr w:type="gramEnd"/>
-      <w:r>
-        <w:rPr>
-          <w:rFonts w:ascii="微軟正黑體" w:eastAsia="微軟正黑體" w:hAnsi="微軟正黑體" w:cs="微軟正黑體"/>
-          <w:color w:val="000000"/>
-        </w:rPr>
-        <w:lastRenderedPageBreak/>
-        <w:t>之效力。</w:t>
+        <w:t>雙方之郵件通知倘因遷址、拒收、招領逾期或其他郵局批註之理由而送達不到者，均以郵局第一次投遞日期為送達日期。無論收送達之ㄧ方是否確實收受（包括拒收），均生送達之效力。</w:t>
       </w:r>
     </w:p>
     <w:p>
@@ -2739,350 +2174,241 @@
           <w:rFonts w:ascii="微軟正黑體" w:eastAsia="微軟正黑體" w:hAnsi="微軟正黑體" w:cs="微軟正黑體"/>
           <w:color w:val="000000"/>
         </w:rPr>
-        <w:t>本契約正本</w:t>
+        <w:t>本契約正本壹式貳份，由甲乙雙方各執壹份以為憑據，印花自理。</w:t>
+      </w:r>
+    </w:p>
+    <w:p>
+      <w:pPr>
+        <w:spacing w:line="420" w:lineRule="auto"/>
+        <w:jc w:val="center"/>
+        <w:rPr>
+          <w:rFonts w:ascii="微軟正黑體" w:eastAsia="微軟正黑體" w:hAnsi="微軟正黑體" w:cs="微軟正黑體"/>
+          <w:color w:val="000000"/>
+        </w:rPr>
+      </w:pPr>
+      <w:r>
+        <w:rPr>
+          <w:rFonts w:ascii="微軟正黑體" w:eastAsia="微軟正黑體" w:hAnsi="微軟正黑體" w:cs="微軟正黑體"/>
+          <w:color w:val="000000"/>
+        </w:rPr>
+        <w:t>（簽名頁如後）</w:t>
+      </w:r>
+    </w:p>
+    <w:p>
+      <w:pPr>
+        <w:rPr>
+          <w:rFonts w:ascii="微軟正黑體" w:eastAsia="微軟正黑體" w:hAnsi="微軟正黑體" w:cs="微軟正黑體"/>
+          <w:color w:val="000000"/>
+        </w:rPr>
+      </w:pPr>
+      <w:r>
+        <w:br w:type="page"/>
+      </w:r>
+    </w:p>
+    <w:p>
+      <w:pPr>
+        <w:spacing w:line="420" w:lineRule="auto"/>
+        <w:jc w:val="both"/>
+        <w:rPr>
+          <w:rFonts w:ascii="微軟正黑體" w:eastAsia="微軟正黑體" w:hAnsi="微軟正黑體" w:cs="微軟正黑體"/>
+          <w:color w:val="000000"/>
+        </w:rPr>
+      </w:pPr>
+    </w:p>
+    <w:p>
+      <w:pPr>
+        <w:spacing w:line="420" w:lineRule="auto"/>
+        <w:jc w:val="both"/>
+        <w:rPr>
+          <w:rFonts w:ascii="微軟正黑體" w:eastAsia="微軟正黑體" w:hAnsi="微軟正黑體" w:cs="微軟正黑體"/>
+          <w:color w:val="000000"/>
+        </w:rPr>
+      </w:pPr>
+      <w:r>
+        <w:rPr>
+          <w:rFonts w:ascii="微軟正黑體" w:eastAsia="微軟正黑體" w:hAnsi="微軟正黑體" w:cs="微軟正黑體"/>
+          <w:color w:val="000000"/>
+        </w:rPr>
+        <w:t>立契約書人</w:t>
+      </w:r>
+    </w:p>
+    <w:p>
+      <w:pPr>
+        <w:spacing w:line="420" w:lineRule="auto"/>
+        <w:jc w:val="both"/>
+        <w:rPr>
+          <w:rFonts w:ascii="微軟正黑體" w:eastAsia="微軟正黑體" w:hAnsi="微軟正黑體" w:cs="微軟正黑體"/>
+          <w:color w:val="000000"/>
+        </w:rPr>
+      </w:pPr>
+    </w:p>
+    <w:p>
+      <w:pPr>
+        <w:spacing w:line="420" w:lineRule="auto"/>
+        <w:jc w:val="both"/>
+        <w:rPr>
+          <w:rFonts w:ascii="微軟正黑體" w:eastAsia="微軟正黑體" w:hAnsi="微軟正黑體" w:cs="微軟正黑體"/>
+          <w:color w:val="000000"/>
+        </w:rPr>
+      </w:pPr>
+      <w:r>
+        <w:rPr>
+          <w:rFonts w:ascii="微軟正黑體" w:eastAsia="微軟正黑體" w:hAnsi="微軟正黑體" w:cs="微軟正黑體"/>
+          <w:color w:val="000000"/>
+        </w:rPr>
+        <w:t xml:space="preserve">甲方（蓋章）： </w:t>
+      </w:r>
+      <w:r>
+        <w:rPr>
+          <w:rFonts w:asciiTheme="minorEastAsia" w:hAnsiTheme="minorEastAsia" w:cs="冬青黑體簡體中文 W3"/>
+          <w:color w:val="000000"/>
+        </w:rPr>
+        <w:t>{{ party_a }}</w:t>
+      </w:r>
+    </w:p>
+    <w:p>
+      <w:pPr>
+        <w:spacing w:line="420" w:lineRule="auto"/>
+        <w:jc w:val="both"/>
+        <w:rPr>
+          <w:rFonts w:asciiTheme="minorEastAsia" w:hAnsiTheme="minorEastAsia" w:cs="冬青黑體簡體中文 W3"/>
+          <w:color w:val="000000"/>
+        </w:rPr>
+      </w:pPr>
+      <w:r>
+        <w:rPr>
+          <w:rFonts w:ascii="微軟正黑體" w:eastAsia="微軟正黑體" w:hAnsi="微軟正黑體" w:cs="微軟正黑體"/>
+          <w:color w:val="000000"/>
+        </w:rPr>
+        <w:t xml:space="preserve">負責人： </w:t>
+      </w:r>
+      <w:r>
+        <w:rPr>
+          <w:rFonts w:asciiTheme="minorEastAsia" w:hAnsiTheme="minorEastAsia" w:cs="冬青黑體簡體中文 W3"/>
+          <w:color w:val="000000"/>
+        </w:rPr>
+        <w:t>{{ owner }}</w:t>
+      </w:r>
+    </w:p>
+    <w:p>
+      <w:pPr>
+        <w:spacing w:line="420" w:lineRule="auto"/>
+        <w:jc w:val="both"/>
+        <w:rPr>
+          <w:rFonts w:ascii="微軟正黑體" w:eastAsia="微軟正黑體" w:hAnsi="微軟正黑體" w:cs="微軟正黑體"/>
+          <w:color w:val="000000"/>
+        </w:rPr>
+      </w:pPr>
+      <w:r>
+        <w:rPr>
+          <w:rFonts w:ascii="微軟正黑體" w:eastAsia="微軟正黑體" w:hAnsi="微軟正黑體" w:cs="微軟正黑體"/>
+          <w:color w:val="000000"/>
+        </w:rPr>
+        <w:t>身分證字號/統</w:t>
+      </w:r>
+      <w:r>
+        <w:rPr>
+          <w:rFonts w:ascii="微軟正黑體" w:eastAsia="微軟正黑體" w:hAnsi="微軟正黑體" w:cs="微軟正黑體" w:hint="eastAsia"/>
+          <w:color w:val="000000"/>
+        </w:rPr>
+        <w:t>一</w:t>
+      </w:r>
+      <w:r>
+        <w:rPr>
+          <w:rFonts w:ascii="微軟正黑體" w:eastAsia="微軟正黑體" w:hAnsi="微軟正黑體" w:cs="微軟正黑體"/>
+          <w:color w:val="000000"/>
+        </w:rPr>
+        <w:t>編</w:t>
+      </w:r>
+      <w:r>
+        <w:rPr>
+          <w:rFonts w:ascii="微軟正黑體" w:eastAsia="微軟正黑體" w:hAnsi="微軟正黑體" w:cs="微軟正黑體" w:hint="eastAsia"/>
+          <w:color w:val="000000"/>
+        </w:rPr>
+        <w:t>號</w:t>
+      </w:r>
+      <w:r>
+        <w:rPr>
+          <w:rFonts w:ascii="微軟正黑體" w:eastAsia="微軟正黑體" w:hAnsi="微軟正黑體" w:cs="微軟正黑體"/>
+          <w:color w:val="000000"/>
+        </w:rPr>
+        <w:t>：</w:t>
+      </w:r>
+      <w:r>
+        <w:rPr>
+          <w:rFonts w:asciiTheme="minorEastAsia" w:hAnsiTheme="minorEastAsia" w:cs="冬青黑體簡體中文 W3"/>
+          <w:color w:val="000000"/>
+        </w:rPr>
+        <w:t>{{ id_number }}</w:t>
+      </w:r>
+    </w:p>
+    <w:p>
+      <w:pPr>
+        <w:spacing w:line="420" w:lineRule="auto"/>
+        <w:jc w:val="both"/>
+        <w:rPr>
+          <w:rFonts w:ascii="微軟正黑體" w:eastAsia="微軟正黑體" w:hAnsi="微軟正黑體" w:cs="微軟正黑體"/>
+          <w:color w:val="000000"/>
+        </w:rPr>
+      </w:pPr>
+      <w:r>
+        <w:rPr>
+          <w:rFonts w:ascii="微軟正黑體" w:eastAsia="微軟正黑體" w:hAnsi="微軟正黑體" w:cs="微軟正黑體"/>
+          <w:color w:val="000000"/>
+        </w:rPr>
+        <w:t>聯絡電話：</w:t>
       </w:r>
       <w:proofErr w:type="gramStart"/>
       <w:r>
         <w:rPr>
-          <w:rFonts w:ascii="微軟正黑體" w:eastAsia="微軟正黑體" w:hAnsi="微軟正黑體" w:cs="微軟正黑體"/>
-          <w:color w:val="000000"/>
-        </w:rPr>
-        <w:t>壹式貳份</w:t>
+          <w:rFonts w:asciiTheme="minorEastAsia" w:hAnsiTheme="minorEastAsia" w:cs="冬青黑體簡體中文 W3"/>
+          <w:color w:val="000000"/>
+        </w:rPr>
+        <w:t>{{ phone</w:t>
       </w:r>
       <w:proofErr w:type="gramEnd"/>
       <w:r>
         <w:rPr>
-          <w:rFonts w:ascii="微軟正黑體" w:eastAsia="微軟正黑體" w:hAnsi="微軟正黑體" w:cs="微軟正黑體"/>
-          <w:color w:val="000000"/>
-        </w:rPr>
-        <w:t>，由甲乙雙方各</w:t>
+          <w:rFonts w:asciiTheme="minorEastAsia" w:hAnsiTheme="minorEastAsia" w:cs="冬青黑體簡體中文 W3"/>
+          <w:color w:val="000000"/>
+        </w:rPr>
+        <w:t xml:space="preserve"> }}</w:t>
+      </w:r>
+    </w:p>
+    <w:p>
+      <w:pPr>
+        <w:spacing w:line="420" w:lineRule="auto"/>
+        <w:jc w:val="both"/>
+        <w:rPr>
+          <w:rFonts w:asciiTheme="minorEastAsia" w:hAnsiTheme="minorEastAsia" w:cs="冬青黑體簡體中文 W3"/>
+        </w:rPr>
+      </w:pPr>
+      <w:r>
+        <w:rPr>
+          <w:rFonts w:ascii="微軟正黑體" w:eastAsia="微軟正黑體" w:hAnsi="微軟正黑體" w:cs="微軟正黑體"/>
+        </w:rPr>
+        <w:t>地址：</w:t>
       </w:r>
       <w:proofErr w:type="gramStart"/>
       <w:r>
         <w:rPr>
-          <w:rFonts w:ascii="微軟正黑體" w:eastAsia="微軟正黑體" w:hAnsi="微軟正黑體" w:cs="微軟正黑體"/>
-          <w:color w:val="000000"/>
-        </w:rPr>
-        <w:t>執壹份</w:t>
+          <w:rFonts w:asciiTheme="minorEastAsia" w:hAnsiTheme="minorEastAsia" w:cs="冬青黑體簡體中文 W3"/>
+        </w:rPr>
+        <w:t>{{ contact</w:t>
       </w:r>
       <w:proofErr w:type="gramEnd"/>
       <w:r>
         <w:rPr>
-          <w:rFonts w:ascii="微軟正黑體" w:eastAsia="微軟正黑體" w:hAnsi="微軟正黑體" w:cs="微軟正黑體"/>
-          <w:color w:val="000000"/>
-        </w:rPr>
-        <w:t>以為憑據，印花自理。</w:t>
-      </w:r>
-    </w:p>
-    <w:p>
-      <w:pPr>
-        <w:spacing w:line="420" w:lineRule="auto"/>
-        <w:jc w:val="center"/>
-        <w:rPr>
-          <w:rFonts w:ascii="微軟正黑體" w:eastAsia="微軟正黑體" w:hAnsi="微軟正黑體" w:cs="微軟正黑體"/>
-          <w:color w:val="000000"/>
-        </w:rPr>
-      </w:pPr>
-      <w:r>
-        <w:rPr>
-          <w:rFonts w:ascii="微軟正黑體" w:eastAsia="微軟正黑體" w:hAnsi="微軟正黑體" w:cs="微軟正黑體"/>
-          <w:color w:val="000000"/>
-        </w:rPr>
-        <w:t>（簽名頁如後）</w:t>
-      </w:r>
-    </w:p>
-    <w:p>
-      <w:pPr>
-        <w:rPr>
-          <w:rFonts w:ascii="微軟正黑體" w:eastAsia="微軟正黑體" w:hAnsi="微軟正黑體" w:cs="微軟正黑體"/>
-          <w:color w:val="000000"/>
-        </w:rPr>
-      </w:pPr>
-      <w:r>
-        <w:br w:type="page"/>
-      </w:r>
-    </w:p>
-    <w:p>
-      <w:pPr>
-        <w:spacing w:line="420" w:lineRule="auto"/>
-        <w:jc w:val="both"/>
-        <w:rPr>
-          <w:rFonts w:ascii="微軟正黑體" w:eastAsia="微軟正黑體" w:hAnsi="微軟正黑體" w:cs="微軟正黑體"/>
-          <w:color w:val="000000"/>
-        </w:rPr>
-      </w:pPr>
-    </w:p>
-    <w:p>
-      <w:pPr>
-        <w:spacing w:line="420" w:lineRule="auto"/>
-        <w:jc w:val="both"/>
-        <w:rPr>
-          <w:rFonts w:ascii="微軟正黑體" w:eastAsia="微軟正黑體" w:hAnsi="微軟正黑體" w:cs="微軟正黑體"/>
-          <w:color w:val="000000"/>
-        </w:rPr>
-      </w:pPr>
-      <w:r>
-        <w:rPr>
-          <w:rFonts w:ascii="微軟正黑體" w:eastAsia="微軟正黑體" w:hAnsi="微軟正黑體" w:cs="微軟正黑體"/>
-          <w:color w:val="000000"/>
-        </w:rPr>
-        <w:t>立契約書人</w:t>
-      </w:r>
-    </w:p>
-    <w:p>
-      <w:pPr>
-        <w:spacing w:line="420" w:lineRule="auto"/>
-        <w:jc w:val="both"/>
-        <w:rPr>
-          <w:rFonts w:ascii="微軟正黑體" w:eastAsia="微軟正黑體" w:hAnsi="微軟正黑體" w:cs="微軟正黑體"/>
-          <w:color w:val="000000"/>
-        </w:rPr>
-      </w:pPr>
-    </w:p>
-    <w:p>
-      <w:pPr>
-        <w:spacing w:line="420" w:lineRule="auto"/>
-        <w:jc w:val="both"/>
-        <w:rPr>
-          <w:rFonts w:ascii="微軟正黑體" w:eastAsia="微軟正黑體" w:hAnsi="微軟正黑體" w:cs="微軟正黑體"/>
-          <w:color w:val="000000"/>
-        </w:rPr>
-      </w:pPr>
-      <w:r>
-        <w:rPr>
-          <w:rFonts w:ascii="微軟正黑體" w:eastAsia="微軟正黑體" w:hAnsi="微軟正黑體" w:cs="微軟正黑體"/>
-          <w:color w:val="000000"/>
-        </w:rPr>
-        <w:t xml:space="preserve">甲方（蓋章）： </w:t>
+          <w:rFonts w:asciiTheme="minorEastAsia" w:hAnsiTheme="minorEastAsia" w:cs="冬青黑體簡體中文 W3"/>
+        </w:rPr>
+        <w:t>_</w:t>
       </w:r>
       <w:proofErr w:type="gramStart"/>
       <w:r>
         <w:rPr>
           <w:rFonts w:asciiTheme="minorEastAsia" w:hAnsiTheme="minorEastAsia" w:cs="冬青黑體簡體中文 W3"/>
-          <w:color w:val="000000"/>
-        </w:rPr>
-        <w:t xml:space="preserve">{{ </w:t>
-      </w:r>
-      <w:proofErr w:type="spellStart"/>
-      <w:r>
-        <w:rPr>
-          <w:rFonts w:asciiTheme="minorEastAsia" w:hAnsiTheme="minorEastAsia" w:cs="冬青黑體簡體中文 W3"/>
-          <w:color w:val="000000"/>
-        </w:rPr>
-        <w:t>party</w:t>
-      </w:r>
-      <w:proofErr w:type="gramEnd"/>
-      <w:r>
-        <w:rPr>
-          <w:rFonts w:asciiTheme="minorEastAsia" w:hAnsiTheme="minorEastAsia" w:cs="冬青黑體簡體中文 W3"/>
-          <w:color w:val="000000"/>
-        </w:rPr>
-        <w:t>_</w:t>
-      </w:r>
-      <w:proofErr w:type="gramStart"/>
-      <w:r>
-        <w:rPr>
-          <w:rFonts w:asciiTheme="minorEastAsia" w:hAnsiTheme="minorEastAsia" w:cs="冬青黑體簡體中文 W3"/>
-          <w:color w:val="000000"/>
-        </w:rPr>
-        <w:t>a</w:t>
-      </w:r>
-      <w:proofErr w:type="spellEnd"/>
-      <w:r>
-        <w:rPr>
-          <w:rFonts w:asciiTheme="minorEastAsia" w:hAnsiTheme="minorEastAsia" w:cs="冬青黑體簡體中文 W3"/>
-          <w:color w:val="000000"/>
-        </w:rPr>
-        <w:t xml:space="preserve"> }</w:t>
-      </w:r>
-      <w:proofErr w:type="gramEnd"/>
-      <w:r>
-        <w:rPr>
-          <w:rFonts w:asciiTheme="minorEastAsia" w:hAnsiTheme="minorEastAsia" w:cs="冬青黑體簡體中文 W3"/>
-          <w:color w:val="000000"/>
-        </w:rPr>
-        <w:t>}</w:t>
-      </w:r>
-    </w:p>
-    <w:p>
-      <w:pPr>
-        <w:spacing w:line="420" w:lineRule="auto"/>
-        <w:jc w:val="both"/>
-        <w:rPr>
-          <w:rFonts w:asciiTheme="minorEastAsia" w:hAnsiTheme="minorEastAsia" w:cs="冬青黑體簡體中文 W3"/>
-          <w:color w:val="000000"/>
-        </w:rPr>
-      </w:pPr>
-      <w:r>
-        <w:rPr>
-          <w:rFonts w:ascii="微軟正黑體" w:eastAsia="微軟正黑體" w:hAnsi="微軟正黑體" w:cs="微軟正黑體"/>
-          <w:color w:val="000000"/>
-        </w:rPr>
-        <w:t xml:space="preserve">負責人： </w:t>
-      </w:r>
-      <w:proofErr w:type="gramStart"/>
-      <w:r>
-        <w:rPr>
-          <w:rFonts w:asciiTheme="minorEastAsia" w:hAnsiTheme="minorEastAsia" w:cs="冬青黑體簡體中文 W3"/>
-          <w:color w:val="000000"/>
-        </w:rPr>
-        <w:t>{{ owner</w:t>
-      </w:r>
-      <w:proofErr w:type="gramEnd"/>
-      <w:r>
-        <w:rPr>
-          <w:rFonts w:asciiTheme="minorEastAsia" w:hAnsiTheme="minorEastAsia" w:cs="冬青黑體簡體中文 W3"/>
-          <w:color w:val="000000"/>
-        </w:rPr>
-        <w:t xml:space="preserve"> }}</w:t>
-      </w:r>
-    </w:p>
-    <w:p>
-      <w:pPr>
-        <w:spacing w:line="420" w:lineRule="auto"/>
-        <w:jc w:val="both"/>
-        <w:rPr>
-          <w:rFonts w:ascii="微軟正黑體" w:eastAsia="微軟正黑體" w:hAnsi="微軟正黑體" w:cs="微軟正黑體"/>
-          <w:color w:val="000000"/>
-        </w:rPr>
-      </w:pPr>
-      <w:r>
-        <w:rPr>
-          <w:rFonts w:ascii="微軟正黑體" w:eastAsia="微軟正黑體" w:hAnsi="微軟正黑體" w:cs="微軟正黑體"/>
-          <w:color w:val="000000"/>
-        </w:rPr>
-        <w:t>身分證字號/統編：</w:t>
-      </w:r>
-      <w:proofErr w:type="gramStart"/>
-      <w:r>
-        <w:rPr>
-          <w:rFonts w:asciiTheme="minorEastAsia" w:hAnsiTheme="minorEastAsia" w:cs="冬青黑體簡體中文 W3"/>
-          <w:color w:val="000000"/>
-        </w:rPr>
-        <w:t xml:space="preserve">{{ </w:t>
-      </w:r>
-      <w:proofErr w:type="spellStart"/>
-      <w:r>
-        <w:rPr>
-          <w:rFonts w:asciiTheme="minorEastAsia" w:hAnsiTheme="minorEastAsia" w:cs="冬青黑體簡體中文 W3"/>
-          <w:color w:val="000000"/>
-        </w:rPr>
-        <w:t>id</w:t>
-      </w:r>
-      <w:proofErr w:type="gramEnd"/>
-      <w:r>
-        <w:rPr>
-          <w:rFonts w:asciiTheme="minorEastAsia" w:hAnsiTheme="minorEastAsia" w:cs="冬青黑體簡體中文 W3"/>
-          <w:color w:val="000000"/>
-        </w:rPr>
-        <w:t>_</w:t>
-      </w:r>
-      <w:proofErr w:type="gramStart"/>
-      <w:r>
-        <w:rPr>
-          <w:rFonts w:asciiTheme="minorEastAsia" w:hAnsiTheme="minorEastAsia" w:cs="冬青黑體簡體中文 W3"/>
-          <w:color w:val="000000"/>
-        </w:rPr>
-        <w:t>number</w:t>
-      </w:r>
-      <w:proofErr w:type="spellEnd"/>
-      <w:r>
-        <w:rPr>
-          <w:rFonts w:asciiTheme="minorEastAsia" w:hAnsiTheme="minorEastAsia" w:cs="冬青黑體簡體中文 W3"/>
-          <w:color w:val="000000"/>
-        </w:rPr>
-        <w:t xml:space="preserve"> }</w:t>
-      </w:r>
-      <w:proofErr w:type="gramEnd"/>
-      <w:r>
-        <w:rPr>
-          <w:rFonts w:asciiTheme="minorEastAsia" w:hAnsiTheme="minorEastAsia" w:cs="冬青黑體簡體中文 W3"/>
-          <w:color w:val="000000"/>
-        </w:rPr>
-        <w:t>}</w:t>
-      </w:r>
-    </w:p>
-    <w:p>
-      <w:pPr>
-        <w:spacing w:line="420" w:lineRule="auto"/>
-        <w:jc w:val="both"/>
-        <w:rPr>
-          <w:rFonts w:ascii="微軟正黑體" w:eastAsia="微軟正黑體" w:hAnsi="微軟正黑體" w:cs="微軟正黑體"/>
-          <w:color w:val="000000"/>
-        </w:rPr>
-      </w:pPr>
-      <w:r>
-        <w:rPr>
-          <w:rFonts w:ascii="微軟正黑體" w:eastAsia="微軟正黑體" w:hAnsi="微軟正黑體" w:cs="微軟正黑體"/>
-          <w:color w:val="000000"/>
-        </w:rPr>
-        <w:t>聯絡電話：</w:t>
-      </w:r>
-      <w:proofErr w:type="gramStart"/>
-      <w:r>
-        <w:rPr>
-          <w:rFonts w:asciiTheme="minorEastAsia" w:hAnsiTheme="minorEastAsia" w:cs="冬青黑體簡體中文 W3"/>
-          <w:color w:val="000000"/>
-        </w:rPr>
-        <w:t>{{ phone</w:t>
-      </w:r>
-      <w:proofErr w:type="gramEnd"/>
-      <w:r>
-        <w:rPr>
-          <w:rFonts w:asciiTheme="minorEastAsia" w:hAnsiTheme="minorEastAsia" w:cs="冬青黑體簡體中文 W3"/>
-          <w:color w:val="000000"/>
-        </w:rPr>
-        <w:t xml:space="preserve"> }}</w:t>
-      </w:r>
-    </w:p>
-    <w:p>
-      <w:pPr>
-        <w:spacing w:line="420" w:lineRule="auto"/>
-        <w:jc w:val="both"/>
-        <w:rPr>
-          <w:rFonts w:asciiTheme="minorEastAsia" w:hAnsiTheme="minorEastAsia" w:cs="冬青黑體簡體中文 W3"/>
-        </w:rPr>
-      </w:pPr>
-      <w:r>
-        <w:rPr>
-          <w:rFonts w:ascii="微軟正黑體" w:eastAsia="微軟正黑體" w:hAnsi="微軟正黑體" w:cs="微軟正黑體"/>
-        </w:rPr>
-        <w:t>地址：</w:t>
-      </w:r>
-      <w:proofErr w:type="gramStart"/>
-      <w:r>
-        <w:rPr>
-          <w:rFonts w:asciiTheme="minorEastAsia" w:hAnsiTheme="minorEastAsia" w:cs="冬青黑體簡體中文 W3"/>
-        </w:rPr>
-        <w:t xml:space="preserve">{{ </w:t>
-      </w:r>
-      <w:proofErr w:type="spellStart"/>
-      <w:r>
-        <w:rPr>
-          <w:rFonts w:asciiTheme="minorEastAsia" w:hAnsiTheme="minorEastAsia" w:cs="冬青黑體簡體中文 W3"/>
-        </w:rPr>
-        <w:t>contact</w:t>
-      </w:r>
-      <w:proofErr w:type="gramEnd"/>
-      <w:r>
-        <w:rPr>
-          <w:rFonts w:asciiTheme="minorEastAsia" w:hAnsiTheme="minorEastAsia" w:cs="冬青黑體簡體中文 W3"/>
-        </w:rPr>
-        <w:t>_</w:t>
-      </w:r>
-      <w:proofErr w:type="gramStart"/>
-      <w:r>
-        <w:rPr>
-          <w:rFonts w:asciiTheme="minorEastAsia" w:hAnsiTheme="minorEastAsia" w:cs="冬青黑體簡體中文 W3"/>
-        </w:rPr>
-        <w:t>address</w:t>
-      </w:r>
-      <w:proofErr w:type="spellEnd"/>
-      <w:r>
-        <w:rPr>
-          <w:rFonts w:asciiTheme="minorEastAsia" w:hAnsiTheme="minorEastAsia" w:cs="冬青黑體簡體中文 W3"/>
-        </w:rPr>
-        <w:t xml:space="preserve"> }</w:t>
+        </w:rPr>
+        <w:t>address }</w:t>
       </w:r>
       <w:proofErr w:type="gramEnd"/>
       <w:r>
@@ -3337,15 +2663,7 @@
           <w:rFonts w:ascii="微軟正黑體" w:eastAsia="微軟正黑體" w:hAnsi="微軟正黑體" w:cs="微軟正黑體"/>
           <w:color w:val="333333"/>
         </w:rPr>
-        <w:t xml:space="preserve">{{ </w:t>
-      </w:r>
-      <w:proofErr w:type="spellStart"/>
-      <w:r>
-        <w:rPr>
-          <w:rFonts w:ascii="微軟正黑體" w:eastAsia="微軟正黑體" w:hAnsi="微軟正黑體" w:cs="微軟正黑體"/>
-          <w:color w:val="333333"/>
-        </w:rPr>
-        <w:t>b</w:t>
+        <w:t>{{ b</w:t>
       </w:r>
       <w:proofErr w:type="gramEnd"/>
       <w:r>
@@ -3363,7 +2681,6 @@
         </w:rPr>
         <w:t>email</w:t>
       </w:r>
-      <w:proofErr w:type="spellEnd"/>
       <w:r>
         <w:rPr>
           <w:rFonts w:ascii="微軟正黑體" w:eastAsia="微軟正黑體" w:hAnsi="微軟正黑體" w:cs="微軟正黑體"/>
@@ -3486,29 +2803,7 @@
           <w:szCs w:val="38"/>
           <w:lang w:val="en-US"/>
         </w:rPr>
-        <w:t xml:space="preserve">{{ </w:t>
-      </w:r>
-      <w:proofErr w:type="spellStart"/>
-      <w:r>
-        <w:rPr>
-          <w:rFonts w:asciiTheme="minorEastAsia" w:hAnsiTheme="minorEastAsia" w:cs="冬青黑體簡體中文 W3"/>
-          <w:color w:val="000000"/>
-          <w:sz w:val="38"/>
-          <w:szCs w:val="38"/>
-          <w:lang w:val="en-US"/>
-        </w:rPr>
-        <w:t>sign_date</w:t>
-      </w:r>
-      <w:proofErr w:type="spellEnd"/>
-      <w:r>
-        <w:rPr>
-          <w:rFonts w:asciiTheme="minorEastAsia" w:hAnsiTheme="minorEastAsia" w:cs="冬青黑體簡體中文 W3"/>
-          <w:color w:val="000000"/>
-          <w:sz w:val="38"/>
-          <w:szCs w:val="38"/>
-          <w:lang w:val="en-US"/>
-        </w:rPr>
-        <w:t xml:space="preserve"> }}</w:t>
+        <w:t>{{ sign_date }}</w:t>
       </w:r>
     </w:p>
     <w:sectPr>
@@ -3787,7 +3082,27 @@
               <w:sz w:val="20"/>
               <w:szCs w:val="20"/>
             </w:rPr>
-            <w:t xml:space="preserve">負責業務：{{ sales }}</w:t>
+            <w:t>負責業務：</w:t>
+          </w:r>
+          <w:proofErr w:type="gramStart"/>
+          <w:r>
+            <w:rPr>
+              <w:rFonts w:ascii="標楷體" w:eastAsia="標楷體" w:hAnsi="標楷體" w:cs="標楷體"/>
+              <w:color w:val="666666"/>
+              <w:sz w:val="20"/>
+              <w:szCs w:val="20"/>
+            </w:rPr>
+            <w:t>{{ sales</w:t>
+          </w:r>
+          <w:proofErr w:type="gramEnd"/>
+          <w:r>
+            <w:rPr>
+              <w:rFonts w:ascii="標楷體" w:eastAsia="標楷體" w:hAnsi="標楷體" w:cs="標楷體"/>
+              <w:color w:val="666666"/>
+              <w:sz w:val="20"/>
+              <w:szCs w:val="20"/>
+            </w:rPr>
+            <w:t xml:space="preserve"> }}</w:t>
           </w:r>
         </w:p>
       </w:tc>
@@ -3814,7 +3129,27 @@
               <w:sz w:val="20"/>
               <w:szCs w:val="20"/>
             </w:rPr>
-            <w:t xml:space="preserve">建物編號：{{ building_id }}</w:t>
+            <w:t>建物編號：</w:t>
+          </w:r>
+          <w:proofErr w:type="gramStart"/>
+          <w:r>
+            <w:rPr>
+              <w:rFonts w:ascii="標楷體" w:eastAsia="標楷體" w:hAnsi="標楷體" w:cs="標楷體"/>
+              <w:color w:val="666666"/>
+              <w:sz w:val="20"/>
+              <w:szCs w:val="20"/>
+            </w:rPr>
+            <w:t>{{ building</w:t>
+          </w:r>
+          <w:proofErr w:type="gramEnd"/>
+          <w:r>
+            <w:rPr>
+              <w:rFonts w:ascii="標楷體" w:eastAsia="標楷體" w:hAnsi="標楷體" w:cs="標楷體"/>
+              <w:color w:val="666666"/>
+              <w:sz w:val="20"/>
+              <w:szCs w:val="20"/>
+            </w:rPr>
+            <w:t>_id }}</w:t>
           </w:r>
         </w:p>
       </w:tc>
@@ -3834,6 +3169,7 @@
               <w:szCs w:val="20"/>
             </w:rPr>
           </w:pPr>
+          <w:proofErr w:type="gramStart"/>
           <w:r>
             <w:rPr>
               <w:rFonts w:ascii="標楷體" w:eastAsia="標楷體" w:hAnsi="標楷體" w:cs="標楷體"/>
@@ -3841,7 +3177,17 @@
               <w:sz w:val="20"/>
               <w:szCs w:val="20"/>
             </w:rPr>
-            <w:t>{{ contract_tax_label }}</w:t>
+            <w:t>{{ contract</w:t>
+          </w:r>
+          <w:proofErr w:type="gramEnd"/>
+          <w:r>
+            <w:rPr>
+              <w:rFonts w:ascii="標楷體" w:eastAsia="標楷體" w:hAnsi="標楷體" w:cs="標楷體"/>
+              <w:color w:val="666666"/>
+              <w:sz w:val="20"/>
+              <w:szCs w:val="20"/>
+            </w:rPr>
+            <w:t>_tax_label }}</w:t>
           </w:r>
         </w:p>
       </w:tc>
@@ -3870,7 +3216,27 @@
               <w:sz w:val="20"/>
               <w:szCs w:val="20"/>
             </w:rPr>
-            <w:t xml:space="preserve">建物名稱：{{ building_name }}</w:t>
+            <w:t>建物名稱：</w:t>
+          </w:r>
+          <w:proofErr w:type="gramStart"/>
+          <w:r>
+            <w:rPr>
+              <w:rFonts w:ascii="標楷體" w:eastAsia="標楷體" w:hAnsi="標楷體" w:cs="標楷體"/>
+              <w:color w:val="666666"/>
+              <w:sz w:val="20"/>
+              <w:szCs w:val="20"/>
+            </w:rPr>
+            <w:t>{{ building</w:t>
+          </w:r>
+          <w:proofErr w:type="gramEnd"/>
+          <w:r>
+            <w:rPr>
+              <w:rFonts w:ascii="標楷體" w:eastAsia="標楷體" w:hAnsi="標楷體" w:cs="標楷體"/>
+              <w:color w:val="666666"/>
+              <w:sz w:val="20"/>
+              <w:szCs w:val="20"/>
+            </w:rPr>
+            <w:t>_name }}</w:t>
           </w:r>
         </w:p>
       </w:tc>
@@ -3897,7 +3263,27 @@
               <w:sz w:val="20"/>
               <w:szCs w:val="20"/>
             </w:rPr>
-            <w:t xml:space="preserve">建物綁定電話：{{ building_phone }}</w:t>
+            <w:t>建物綁定電話：</w:t>
+          </w:r>
+          <w:proofErr w:type="gramStart"/>
+          <w:r>
+            <w:rPr>
+              <w:rFonts w:ascii="標楷體" w:eastAsia="標楷體" w:hAnsi="標楷體" w:cs="標楷體"/>
+              <w:color w:val="666666"/>
+              <w:sz w:val="20"/>
+              <w:szCs w:val="20"/>
+            </w:rPr>
+            <w:t>{{ building</w:t>
+          </w:r>
+          <w:proofErr w:type="gramEnd"/>
+          <w:r>
+            <w:rPr>
+              <w:rFonts w:ascii="標楷體" w:eastAsia="標楷體" w:hAnsi="標楷體" w:cs="標楷體"/>
+              <w:color w:val="666666"/>
+              <w:sz w:val="20"/>
+              <w:szCs w:val="20"/>
+            </w:rPr>
+            <w:t>_phone }}</w:t>
           </w:r>
         </w:p>
       </w:tc>
@@ -3924,7 +3310,27 @@
               <w:sz w:val="20"/>
               <w:szCs w:val="20"/>
             </w:rPr>
-            <w:t xml:space="preserve">所得代號：{{ income_code }}</w:t>
+            <w:t>所得代號：</w:t>
+          </w:r>
+          <w:proofErr w:type="gramStart"/>
+          <w:r>
+            <w:rPr>
+              <w:rFonts w:ascii="標楷體" w:eastAsia="標楷體" w:hAnsi="標楷體" w:cs="標楷體"/>
+              <w:color w:val="666666"/>
+              <w:sz w:val="20"/>
+              <w:szCs w:val="20"/>
+            </w:rPr>
+            <w:t>{{ income</w:t>
+          </w:r>
+          <w:proofErr w:type="gramEnd"/>
+          <w:r>
+            <w:rPr>
+              <w:rFonts w:ascii="標楷體" w:eastAsia="標楷體" w:hAnsi="標楷體" w:cs="標楷體"/>
+              <w:color w:val="666666"/>
+              <w:sz w:val="20"/>
+              <w:szCs w:val="20"/>
+            </w:rPr>
+            <w:t>_code }}</w:t>
           </w:r>
         </w:p>
       </w:tc>

</xml_diff>